<commit_message>
updated Fade parameters documentation
</commit_message>
<xml_diff>
--- a/Sound Commands Definitions and Parameters.docx
+++ b/Sound Commands Definitions and Parameters.docx
@@ -2846,19 +2846,17 @@
           <w:sz w:val="27"/>
           <w:szCs w:val="27"/>
         </w:rPr>
-        <w:t xml:space="preserve"> to be </w:t>
-      </w:r>
-      <w:proofErr w:type="spellStart"/>
-      <w:r>
-        <w:rPr>
-          <w:rFonts w:ascii="Times New Roman" w:hAnsi="Times New Roman" w:cs="Times New Roman"/>
-          <w:color w:val="323130"/>
-          <w:sz w:val="27"/>
-          <w:szCs w:val="27"/>
-        </w:rPr>
-        <w:t>tweened</w:t>
-      </w:r>
-      <w:proofErr w:type="spellEnd"/>
+        <w:t xml:space="preserve"> t</w:t>
+      </w:r>
+      <w:r>
+        <w:rPr>
+          <w:rFonts w:ascii="Times New Roman" w:hAnsi="Times New Roman" w:cs="Times New Roman"/>
+          <w:color w:val="323130"/>
+          <w:sz w:val="27"/>
+          <w:szCs w:val="27"/>
+        </w:rPr>
+        <w:t>o fade in our out</w:t>
+      </w:r>
       <w:r>
         <w:rPr>
           <w:rFonts w:ascii="Times New Roman" w:hAnsi="Times New Roman" w:cs="Times New Roman"/>
@@ -2890,7 +2888,7 @@
           <w:sz w:val="27"/>
           <w:szCs w:val="27"/>
         </w:rPr>
-        <w:t>volume: (optional) the end value of the volume. This is the destination volume. If volume is not specified here, the volume will not be affected.</w:t>
+        <w:t>volume: the end value of the volume. This is the destination volume.</w:t>
       </w:r>
     </w:p>
     <w:p>
@@ -2938,7 +2936,502 @@
           <w:sz w:val="27"/>
           <w:szCs w:val="27"/>
         </w:rPr>
-        <w:t>delay: (optional) the time in milliseconds to delay the fade command for.</w:t>
+        <w:t>delay: the time in milliseconds to delay the fade command for.</w:t>
+      </w:r>
+    </w:p>
+    <w:p>
+      <w:pPr>
+        <w:spacing w:after="240"/>
+        <w:rPr>
+          <w:rFonts w:ascii="Times New Roman" w:hAnsi="Times New Roman" w:cs="Times New Roman"/>
+          <w:color w:val="323130"/>
+          <w:sz w:val="27"/>
+          <w:szCs w:val="27"/>
+        </w:rPr>
+      </w:pPr>
+      <w:r>
+        <w:rPr>
+          <w:rFonts w:ascii="Times New Roman" w:hAnsi="Times New Roman" w:cs="Times New Roman"/>
+          <w:color w:val="323130"/>
+          <w:sz w:val="27"/>
+          <w:szCs w:val="27"/>
+        </w:rPr>
+        <w:lastRenderedPageBreak/>
+        <w:t xml:space="preserve">This example will fade an already-playing loop to </w:t>
+      </w:r>
+      <w:r>
+        <w:rPr>
+          <w:rFonts w:ascii="Times New Roman" w:hAnsi="Times New Roman" w:cs="Times New Roman"/>
+          <w:color w:val="323130"/>
+          <w:sz w:val="27"/>
+          <w:szCs w:val="27"/>
+        </w:rPr>
+        <w:t xml:space="preserve">volume </w:t>
+      </w:r>
+      <w:r>
+        <w:rPr>
+          <w:rFonts w:ascii="Times New Roman" w:hAnsi="Times New Roman" w:cs="Times New Roman"/>
+          <w:color w:val="323130"/>
+          <w:sz w:val="27"/>
+          <w:szCs w:val="27"/>
+        </w:rPr>
+        <w:t>0</w:t>
+      </w:r>
+      <w:r>
+        <w:rPr>
+          <w:rFonts w:ascii="Times New Roman" w:hAnsi="Times New Roman" w:cs="Times New Roman"/>
+          <w:color w:val="323130"/>
+          <w:sz w:val="27"/>
+          <w:szCs w:val="27"/>
+        </w:rPr>
+        <w:t xml:space="preserve"> with a ramp time of 100ms after a delay of 50ms:</w:t>
+      </w:r>
+    </w:p>
+    <w:p>
+      <w:pPr>
+        <w:spacing w:after="240"/>
+        <w:rPr>
+          <w:rFonts w:ascii="Times New Roman" w:hAnsi="Times New Roman" w:cs="Times New Roman"/>
+          <w:color w:val="323130"/>
+          <w:sz w:val="27"/>
+          <w:szCs w:val="27"/>
+        </w:rPr>
+      </w:pPr>
+      <w:r>
+        <w:rPr>
+          <w:rFonts w:ascii="Times New Roman" w:hAnsi="Times New Roman" w:cs="Times New Roman"/>
+          <w:color w:val="323130"/>
+          <w:sz w:val="27"/>
+          <w:szCs w:val="27"/>
+        </w:rPr>
+        <w:t>"onBonusGameSpinStart</w:t>
+      </w:r>
+      <w:proofErr w:type="gramStart"/>
+      <w:r>
+        <w:rPr>
+          <w:rFonts w:ascii="Times New Roman" w:hAnsi="Times New Roman" w:cs="Times New Roman"/>
+          <w:color w:val="323130"/>
+          <w:sz w:val="27"/>
+          <w:szCs w:val="27"/>
+        </w:rPr>
+        <w:t>":[</w:t>
+      </w:r>
+      <w:proofErr w:type="gramEnd"/>
+    </w:p>
+    <w:p>
+      <w:pPr>
+        <w:spacing w:after="240"/>
+        <w:rPr>
+          <w:rFonts w:ascii="Times New Roman" w:hAnsi="Times New Roman" w:cs="Times New Roman"/>
+          <w:color w:val="323130"/>
+          <w:sz w:val="27"/>
+          <w:szCs w:val="27"/>
+        </w:rPr>
+      </w:pPr>
+      <w:r>
+        <w:rPr>
+          <w:rFonts w:ascii="Times New Roman" w:hAnsi="Times New Roman" w:cs="Times New Roman"/>
+          <w:color w:val="323130"/>
+          <w:sz w:val="27"/>
+          <w:szCs w:val="27"/>
+        </w:rPr>
+        <w:t>{"command":"Fade","spriteId":"s_BaseMusicLoop","volume":</w:t>
+      </w:r>
+      <w:r>
+        <w:rPr>
+          <w:rFonts w:ascii="Times New Roman" w:hAnsi="Times New Roman" w:cs="Times New Roman"/>
+          <w:color w:val="323130"/>
+          <w:sz w:val="27"/>
+          <w:szCs w:val="27"/>
+        </w:rPr>
+        <w:t>0</w:t>
+      </w:r>
+      <w:r>
+        <w:rPr>
+          <w:rFonts w:ascii="Times New Roman" w:hAnsi="Times New Roman" w:cs="Times New Roman"/>
+          <w:color w:val="323130"/>
+          <w:sz w:val="27"/>
+          <w:szCs w:val="27"/>
+        </w:rPr>
+        <w:t>,"duration":100,"delay":50},</w:t>
+      </w:r>
+    </w:p>
+    <w:p>
+      <w:pPr>
+        <w:spacing w:after="240"/>
+        <w:rPr>
+          <w:rFonts w:ascii="Times New Roman" w:hAnsi="Times New Roman" w:cs="Times New Roman"/>
+          <w:color w:val="323130"/>
+          <w:sz w:val="27"/>
+          <w:szCs w:val="27"/>
+        </w:rPr>
+      </w:pPr>
+    </w:p>
+    <w:p>
+      <w:pPr>
+        <w:spacing w:after="240"/>
+        <w:rPr>
+          <w:rFonts w:ascii="Times New Roman" w:hAnsi="Times New Roman" w:cs="Times New Roman"/>
+          <w:color w:val="323130"/>
+          <w:sz w:val="27"/>
+          <w:szCs w:val="27"/>
+        </w:rPr>
+      </w:pPr>
+      <w:r>
+        <w:rPr>
+          <w:rFonts w:ascii="Times New Roman" w:hAnsi="Times New Roman" w:cs="Times New Roman"/>
+          <w:color w:val="323130"/>
+          <w:sz w:val="27"/>
+          <w:szCs w:val="27"/>
+        </w:rPr>
+        <w:t xml:space="preserve">This example will play a transition SFX, </w:t>
+      </w:r>
+      <w:proofErr w:type="gramStart"/>
+      <w:r>
+        <w:rPr>
+          <w:rFonts w:ascii="Times New Roman" w:hAnsi="Times New Roman" w:cs="Times New Roman"/>
+          <w:color w:val="323130"/>
+          <w:sz w:val="27"/>
+          <w:szCs w:val="27"/>
+        </w:rPr>
+        <w:t>and also</w:t>
+      </w:r>
+      <w:proofErr w:type="gramEnd"/>
+      <w:r>
+        <w:rPr>
+          <w:rFonts w:ascii="Times New Roman" w:hAnsi="Times New Roman" w:cs="Times New Roman"/>
+          <w:color w:val="323130"/>
+          <w:sz w:val="27"/>
+          <w:szCs w:val="27"/>
+        </w:rPr>
+        <w:t xml:space="preserve"> fade and stop the base game's background music loop:</w:t>
+      </w:r>
+    </w:p>
+    <w:p>
+      <w:pPr>
+        <w:spacing w:after="240"/>
+        <w:rPr>
+          <w:rFonts w:ascii="Times New Roman" w:hAnsi="Times New Roman" w:cs="Times New Roman"/>
+          <w:color w:val="323130"/>
+          <w:sz w:val="27"/>
+          <w:szCs w:val="27"/>
+        </w:rPr>
+      </w:pPr>
+      <w:r>
+        <w:rPr>
+          <w:rFonts w:ascii="Times New Roman" w:hAnsi="Times New Roman" w:cs="Times New Roman"/>
+          <w:color w:val="323130"/>
+          <w:sz w:val="27"/>
+          <w:szCs w:val="27"/>
+        </w:rPr>
+        <w:t>"</w:t>
+      </w:r>
+      <w:r>
+        <w:t xml:space="preserve"> </w:t>
+      </w:r>
+      <w:r>
+        <w:rPr>
+          <w:rFonts w:ascii="Times New Roman" w:hAnsi="Times New Roman" w:cs="Times New Roman"/>
+          <w:color w:val="323130"/>
+          <w:sz w:val="27"/>
+          <w:szCs w:val="27"/>
+        </w:rPr>
+        <w:t>onBaseToBonusStart</w:t>
+      </w:r>
+      <w:r>
+        <w:rPr>
+          <w:rFonts w:ascii="Times New Roman" w:hAnsi="Times New Roman" w:cs="Times New Roman"/>
+          <w:color w:val="323130"/>
+          <w:sz w:val="27"/>
+          <w:szCs w:val="27"/>
+        </w:rPr>
+        <w:t xml:space="preserve"> </w:t>
+      </w:r>
+      <w:r>
+        <w:rPr>
+          <w:rFonts w:ascii="Times New Roman" w:hAnsi="Times New Roman" w:cs="Times New Roman"/>
+          <w:color w:val="323130"/>
+          <w:sz w:val="27"/>
+          <w:szCs w:val="27"/>
+        </w:rPr>
+        <w:t xml:space="preserve">": </w:t>
+      </w:r>
+    </w:p>
+    <w:p>
+      <w:pPr>
+        <w:spacing w:after="240"/>
+        <w:rPr>
+          <w:rFonts w:ascii="Times New Roman" w:hAnsi="Times New Roman" w:cs="Times New Roman"/>
+          <w:color w:val="323130"/>
+          <w:sz w:val="27"/>
+          <w:szCs w:val="27"/>
+        </w:rPr>
+      </w:pPr>
+      <w:r>
+        <w:rPr>
+          <w:rFonts w:ascii="Times New Roman" w:hAnsi="Times New Roman" w:cs="Times New Roman"/>
+          <w:color w:val="323130"/>
+          <w:sz w:val="27"/>
+          <w:szCs w:val="27"/>
+        </w:rPr>
+        <w:t>[</w:t>
+      </w:r>
+    </w:p>
+    <w:p>
+      <w:pPr>
+        <w:spacing w:after="240"/>
+        <w:rPr>
+          <w:rFonts w:ascii="Times New Roman" w:hAnsi="Times New Roman" w:cs="Times New Roman"/>
+          <w:color w:val="323130"/>
+          <w:sz w:val="27"/>
+          <w:szCs w:val="27"/>
+        </w:rPr>
+      </w:pPr>
+      <w:r>
+        <w:rPr>
+          <w:rFonts w:ascii="Times New Roman" w:hAnsi="Times New Roman" w:cs="Times New Roman"/>
+          <w:color w:val="323130"/>
+          <w:sz w:val="27"/>
+          <w:szCs w:val="27"/>
+        </w:rPr>
+        <w:t>{"command": "Play","</w:t>
+      </w:r>
+      <w:proofErr w:type="spellStart"/>
+      <w:r>
+        <w:rPr>
+          <w:rFonts w:ascii="Times New Roman" w:hAnsi="Times New Roman" w:cs="Times New Roman"/>
+          <w:color w:val="323130"/>
+          <w:sz w:val="27"/>
+          <w:szCs w:val="27"/>
+        </w:rPr>
+        <w:t>spriteId</w:t>
+      </w:r>
+      <w:proofErr w:type="spellEnd"/>
+      <w:r>
+        <w:rPr>
+          <w:rFonts w:ascii="Times New Roman" w:hAnsi="Times New Roman" w:cs="Times New Roman"/>
+          <w:color w:val="323130"/>
+          <w:sz w:val="27"/>
+          <w:szCs w:val="27"/>
+        </w:rPr>
+        <w:t>": "</w:t>
+      </w:r>
+      <w:r>
+        <w:t xml:space="preserve"> </w:t>
+      </w:r>
+      <w:proofErr w:type="spellStart"/>
+      <w:r>
+        <w:rPr>
+          <w:rFonts w:ascii="Times New Roman" w:hAnsi="Times New Roman" w:cs="Times New Roman"/>
+          <w:color w:val="323130"/>
+          <w:sz w:val="27"/>
+          <w:szCs w:val="27"/>
+        </w:rPr>
+        <w:t>s_BaseToBonusStart</w:t>
+      </w:r>
+      <w:proofErr w:type="spellEnd"/>
+      <w:r>
+        <w:rPr>
+          <w:rFonts w:ascii="Times New Roman" w:hAnsi="Times New Roman" w:cs="Times New Roman"/>
+          <w:color w:val="323130"/>
+          <w:sz w:val="27"/>
+          <w:szCs w:val="27"/>
+        </w:rPr>
+        <w:t xml:space="preserve"> </w:t>
+      </w:r>
+      <w:r>
+        <w:rPr>
+          <w:rFonts w:ascii="Times New Roman" w:hAnsi="Times New Roman" w:cs="Times New Roman"/>
+          <w:color w:val="323130"/>
+          <w:sz w:val="27"/>
+          <w:szCs w:val="27"/>
+        </w:rPr>
+        <w:t>"},</w:t>
+      </w:r>
+    </w:p>
+    <w:p>
+      <w:pPr>
+        <w:spacing w:after="240"/>
+        <w:rPr>
+          <w:rFonts w:ascii="Times New Roman" w:hAnsi="Times New Roman" w:cs="Times New Roman"/>
+          <w:color w:val="323130"/>
+          <w:sz w:val="27"/>
+          <w:szCs w:val="27"/>
+        </w:rPr>
+      </w:pPr>
+      <w:r>
+        <w:rPr>
+          <w:rFonts w:ascii="Times New Roman" w:hAnsi="Times New Roman" w:cs="Times New Roman"/>
+          <w:color w:val="323130"/>
+          <w:sz w:val="27"/>
+          <w:szCs w:val="27"/>
+        </w:rPr>
+        <w:t>{"command": "Fade","</w:t>
+      </w:r>
+      <w:proofErr w:type="spellStart"/>
+      <w:r>
+        <w:rPr>
+          <w:rFonts w:ascii="Times New Roman" w:hAnsi="Times New Roman" w:cs="Times New Roman"/>
+          <w:color w:val="323130"/>
+          <w:sz w:val="27"/>
+          <w:szCs w:val="27"/>
+        </w:rPr>
+        <w:t>spriteId</w:t>
+      </w:r>
+      <w:proofErr w:type="spellEnd"/>
+      <w:r>
+        <w:rPr>
+          <w:rFonts w:ascii="Times New Roman" w:hAnsi="Times New Roman" w:cs="Times New Roman"/>
+          <w:color w:val="323130"/>
+          <w:sz w:val="27"/>
+          <w:szCs w:val="27"/>
+        </w:rPr>
+        <w:t>": "</w:t>
+      </w:r>
+      <w:proofErr w:type="spellStart"/>
+      <w:r>
+        <w:rPr>
+          <w:rFonts w:ascii="Times New Roman" w:hAnsi="Times New Roman" w:cs="Times New Roman"/>
+          <w:color w:val="323130"/>
+          <w:sz w:val="27"/>
+          <w:szCs w:val="27"/>
+        </w:rPr>
+        <w:t>s_</w:t>
+      </w:r>
+      <w:r>
+        <w:rPr>
+          <w:rFonts w:ascii="Times New Roman" w:hAnsi="Times New Roman" w:cs="Times New Roman"/>
+          <w:color w:val="323130"/>
+          <w:sz w:val="27"/>
+          <w:szCs w:val="27"/>
+        </w:rPr>
+        <w:t>BaseMusicLoop</w:t>
+      </w:r>
+      <w:r>
+        <w:rPr>
+          <w:rFonts w:ascii="Times New Roman" w:hAnsi="Times New Roman" w:cs="Times New Roman"/>
+          <w:color w:val="323130"/>
+          <w:sz w:val="27"/>
+          <w:szCs w:val="27"/>
+        </w:rPr>
+        <w:t>","volume</w:t>
+      </w:r>
+      <w:proofErr w:type="spellEnd"/>
+      <w:r>
+        <w:rPr>
+          <w:rFonts w:ascii="Times New Roman" w:hAnsi="Times New Roman" w:cs="Times New Roman"/>
+          <w:color w:val="323130"/>
+          <w:sz w:val="27"/>
+          <w:szCs w:val="27"/>
+        </w:rPr>
+        <w:t>": 0,"duration": 3000},</w:t>
+      </w:r>
+    </w:p>
+    <w:p>
+      <w:pPr>
+        <w:spacing w:after="240"/>
+        <w:rPr>
+          <w:rFonts w:ascii="Times New Roman" w:hAnsi="Times New Roman" w:cs="Times New Roman"/>
+          <w:color w:val="323130"/>
+          <w:sz w:val="27"/>
+          <w:szCs w:val="27"/>
+        </w:rPr>
+      </w:pPr>
+      <w:r>
+        <w:rPr>
+          <w:rFonts w:ascii="Times New Roman" w:hAnsi="Times New Roman" w:cs="Times New Roman"/>
+          <w:color w:val="323130"/>
+          <w:sz w:val="27"/>
+          <w:szCs w:val="27"/>
+        </w:rPr>
+        <w:t>{"command": "Stop","</w:t>
+      </w:r>
+      <w:proofErr w:type="spellStart"/>
+      <w:r>
+        <w:rPr>
+          <w:rFonts w:ascii="Times New Roman" w:hAnsi="Times New Roman" w:cs="Times New Roman"/>
+          <w:color w:val="323130"/>
+          <w:sz w:val="27"/>
+          <w:szCs w:val="27"/>
+        </w:rPr>
+        <w:t>spriteId</w:t>
+      </w:r>
+      <w:proofErr w:type="spellEnd"/>
+      <w:r>
+        <w:rPr>
+          <w:rFonts w:ascii="Times New Roman" w:hAnsi="Times New Roman" w:cs="Times New Roman"/>
+          <w:color w:val="323130"/>
+          <w:sz w:val="27"/>
+          <w:szCs w:val="27"/>
+        </w:rPr>
+        <w:t>": "</w:t>
+      </w:r>
+      <w:r>
+        <w:rPr>
+          <w:rFonts w:ascii="Times New Roman" w:hAnsi="Times New Roman" w:cs="Times New Roman"/>
+          <w:color w:val="323130"/>
+          <w:sz w:val="27"/>
+          <w:szCs w:val="27"/>
+        </w:rPr>
+        <w:t xml:space="preserve"> </w:t>
+      </w:r>
+      <w:proofErr w:type="spellStart"/>
+      <w:r>
+        <w:rPr>
+          <w:rFonts w:ascii="Times New Roman" w:hAnsi="Times New Roman" w:cs="Times New Roman"/>
+          <w:color w:val="323130"/>
+          <w:sz w:val="27"/>
+          <w:szCs w:val="27"/>
+        </w:rPr>
+        <w:t>s_</w:t>
+      </w:r>
+      <w:r>
+        <w:rPr>
+          <w:rFonts w:ascii="Times New Roman" w:hAnsi="Times New Roman" w:cs="Times New Roman"/>
+          <w:color w:val="323130"/>
+          <w:sz w:val="27"/>
+          <w:szCs w:val="27"/>
+        </w:rPr>
+        <w:t>BaseMusicLoop</w:t>
+      </w:r>
+      <w:r>
+        <w:rPr>
+          <w:rFonts w:ascii="Times New Roman" w:hAnsi="Times New Roman" w:cs="Times New Roman"/>
+          <w:color w:val="323130"/>
+          <w:sz w:val="27"/>
+          <w:szCs w:val="27"/>
+        </w:rPr>
+        <w:t>","delay</w:t>
+      </w:r>
+      <w:proofErr w:type="spellEnd"/>
+      <w:r>
+        <w:rPr>
+          <w:rFonts w:ascii="Times New Roman" w:hAnsi="Times New Roman" w:cs="Times New Roman"/>
+          <w:color w:val="323130"/>
+          <w:sz w:val="27"/>
+          <w:szCs w:val="27"/>
+        </w:rPr>
+        <w:t>": 3100}</w:t>
+      </w:r>
+    </w:p>
+    <w:p>
+      <w:pPr>
+        <w:spacing w:after="240"/>
+        <w:rPr>
+          <w:rFonts w:ascii="Times New Roman" w:hAnsi="Times New Roman" w:cs="Times New Roman"/>
+          <w:color w:val="323130"/>
+          <w:sz w:val="27"/>
+          <w:szCs w:val="27"/>
+        </w:rPr>
+      </w:pPr>
+      <w:r>
+        <w:rPr>
+          <w:rFonts w:ascii="Times New Roman" w:hAnsi="Times New Roman" w:cs="Times New Roman"/>
+          <w:color w:val="323130"/>
+          <w:sz w:val="27"/>
+          <w:szCs w:val="27"/>
+        </w:rPr>
+        <w:t>],</w:t>
       </w:r>
     </w:p>
     <w:p>
@@ -2962,10 +3455,8 @@
           <w:sz w:val="27"/>
           <w:szCs w:val="27"/>
         </w:rPr>
-        <w:lastRenderedPageBreak/>
-        <w:t xml:space="preserve">(Note that any other command called on the same </w:t>
-      </w:r>
-      <w:proofErr w:type="spellStart"/>
+        <w:t>Note</w:t>
+      </w:r>
       <w:r>
         <w:rPr>
           <w:rFonts w:ascii="Times New Roman" w:hAnsi="Times New Roman" w:cs="Times New Roman"/>
@@ -2975,14 +3466,60 @@
           <w:sz w:val="27"/>
           <w:szCs w:val="27"/>
         </w:rPr>
+        <w:t>s:</w:t>
+      </w:r>
+    </w:p>
+    <w:p>
+      <w:pPr>
+        <w:spacing w:after="240"/>
+        <w:rPr>
+          <w:rFonts w:ascii="Times New Roman" w:hAnsi="Times New Roman" w:cs="Times New Roman"/>
+          <w:color w:val="323130"/>
+          <w:sz w:val="27"/>
+          <w:szCs w:val="27"/>
+        </w:rPr>
+      </w:pPr>
+      <w:r>
+        <w:rPr>
+          <w:rFonts w:ascii="Times New Roman" w:hAnsi="Times New Roman" w:cs="Times New Roman"/>
+          <w:color w:val="323130"/>
+          <w:sz w:val="27"/>
+          <w:szCs w:val="27"/>
+        </w:rPr>
+        <w:t>A</w:t>
+      </w:r>
+      <w:r>
+        <w:rPr>
+          <w:rFonts w:ascii="Times New Roman" w:hAnsi="Times New Roman" w:cs="Times New Roman"/>
+          <w:color w:val="323130"/>
+          <w:sz w:val="27"/>
+          <w:szCs w:val="27"/>
+        </w:rPr>
+        <w:t xml:space="preserve"> new “Fade” </w:t>
+      </w:r>
+      <w:r>
+        <w:rPr>
+          <w:rFonts w:ascii="Times New Roman" w:hAnsi="Times New Roman" w:cs="Times New Roman"/>
+          <w:color w:val="323130"/>
+          <w:sz w:val="27"/>
+          <w:szCs w:val="27"/>
+        </w:rPr>
+        <w:t xml:space="preserve">command called on the same </w:t>
+      </w:r>
+      <w:proofErr w:type="spellStart"/>
+      <w:r>
+        <w:rPr>
+          <w:rFonts w:ascii="Times New Roman" w:hAnsi="Times New Roman" w:cs="Times New Roman"/>
+          <w:color w:val="323130"/>
+          <w:sz w:val="27"/>
+          <w:szCs w:val="27"/>
+        </w:rPr>
         <w:t>spriteId</w:t>
       </w:r>
       <w:proofErr w:type="spellEnd"/>
       <w:r>
         <w:rPr>
           <w:rFonts w:ascii="Times New Roman" w:hAnsi="Times New Roman" w:cs="Times New Roman"/>
-          <w:b/>
-          <w:bCs/>
           <w:color w:val="323130"/>
           <w:sz w:val="27"/>
           <w:szCs w:val="27"/>
@@ -2993,555 +3530,308 @@
       <w:r>
         <w:rPr>
           <w:rFonts w:ascii="Times New Roman" w:hAnsi="Times New Roman" w:cs="Times New Roman"/>
-          <w:b/>
-          <w:bCs/>
           <w:color w:val="323130"/>
           <w:sz w:val="27"/>
           <w:szCs w:val="27"/>
         </w:rPr>
         <w:t>spriteList</w:t>
       </w:r>
-      <w:proofErr w:type="spellEnd"/>
-      <w:r>
-        <w:rPr>
-          <w:rFonts w:ascii="Times New Roman" w:hAnsi="Times New Roman" w:cs="Times New Roman"/>
-          <w:b/>
-          <w:bCs/>
-          <w:color w:val="323130"/>
-          <w:sz w:val="27"/>
-          <w:szCs w:val="27"/>
-        </w:rPr>
-        <w:t xml:space="preserve"> id will cancel this delay and command) </w:t>
-      </w:r>
-      <w:r>
-        <w:rPr>
-          <w:rFonts w:ascii="Times New Roman" w:hAnsi="Times New Roman" w:cs="Times New Roman"/>
-          <w:b/>
-          <w:bCs/>
-          <w:color w:val="323130"/>
-          <w:sz w:val="27"/>
-          <w:szCs w:val="27"/>
-        </w:rPr>
-        <w:t xml:space="preserve">* not working July 6, </w:t>
+      <w:r>
+        <w:rPr>
+          <w:rFonts w:ascii="Times New Roman" w:hAnsi="Times New Roman" w:cs="Times New Roman"/>
+          <w:color w:val="323130"/>
+          <w:sz w:val="27"/>
+          <w:szCs w:val="27"/>
+        </w:rPr>
+        <w:t>I</w:t>
+      </w:r>
+      <w:r>
+        <w:rPr>
+          <w:rFonts w:ascii="Times New Roman" w:hAnsi="Times New Roman" w:cs="Times New Roman"/>
+          <w:color w:val="323130"/>
+          <w:sz w:val="27"/>
+          <w:szCs w:val="27"/>
+        </w:rPr>
+        <w:t>d</w:t>
+      </w:r>
+      <w:proofErr w:type="spellEnd"/>
+      <w:r>
+        <w:rPr>
+          <w:rFonts w:ascii="Times New Roman" w:hAnsi="Times New Roman" w:cs="Times New Roman"/>
+          <w:color w:val="323130"/>
+          <w:sz w:val="27"/>
+          <w:szCs w:val="27"/>
+        </w:rPr>
+        <w:t xml:space="preserve"> will cancel </w:t>
+      </w:r>
+      <w:r>
+        <w:rPr>
+          <w:rFonts w:ascii="Times New Roman" w:hAnsi="Times New Roman" w:cs="Times New Roman"/>
+          <w:color w:val="323130"/>
+          <w:sz w:val="27"/>
+          <w:szCs w:val="27"/>
+        </w:rPr>
+        <w:t>the</w:t>
+      </w:r>
+      <w:r>
+        <w:rPr>
+          <w:rFonts w:ascii="Times New Roman" w:hAnsi="Times New Roman" w:cs="Times New Roman"/>
+          <w:color w:val="323130"/>
+          <w:sz w:val="27"/>
+          <w:szCs w:val="27"/>
+        </w:rPr>
+        <w:t xml:space="preserve"> </w:t>
+      </w:r>
+      <w:r>
+        <w:rPr>
+          <w:rFonts w:ascii="Times New Roman" w:hAnsi="Times New Roman" w:cs="Times New Roman"/>
+          <w:color w:val="323130"/>
+          <w:sz w:val="27"/>
+          <w:szCs w:val="27"/>
+        </w:rPr>
+        <w:t xml:space="preserve">previous </w:t>
+      </w:r>
+      <w:r>
+        <w:rPr>
+          <w:rFonts w:ascii="Times New Roman" w:hAnsi="Times New Roman" w:cs="Times New Roman"/>
+          <w:color w:val="323130"/>
+          <w:sz w:val="27"/>
+          <w:szCs w:val="27"/>
+        </w:rPr>
+        <w:t>“</w:t>
+      </w:r>
+      <w:r>
+        <w:rPr>
+          <w:rFonts w:ascii="Times New Roman" w:hAnsi="Times New Roman" w:cs="Times New Roman"/>
+          <w:color w:val="323130"/>
+          <w:sz w:val="27"/>
+          <w:szCs w:val="27"/>
+        </w:rPr>
+        <w:t>delay</w:t>
+      </w:r>
+      <w:r>
+        <w:rPr>
+          <w:rFonts w:ascii="Times New Roman" w:hAnsi="Times New Roman" w:cs="Times New Roman"/>
+          <w:color w:val="323130"/>
+          <w:sz w:val="27"/>
+          <w:szCs w:val="27"/>
+        </w:rPr>
+        <w:t>”</w:t>
+      </w:r>
+      <w:r>
+        <w:rPr>
+          <w:rFonts w:ascii="Times New Roman" w:hAnsi="Times New Roman" w:cs="Times New Roman"/>
+          <w:color w:val="323130"/>
+          <w:sz w:val="27"/>
+          <w:szCs w:val="27"/>
+        </w:rPr>
+        <w:t xml:space="preserve"> and </w:t>
+      </w:r>
+      <w:r>
+        <w:rPr>
+          <w:rFonts w:ascii="Times New Roman" w:hAnsi="Times New Roman" w:cs="Times New Roman"/>
+          <w:color w:val="323130"/>
+          <w:sz w:val="27"/>
+          <w:szCs w:val="27"/>
+        </w:rPr>
+        <w:t>“</w:t>
+      </w:r>
+      <w:r>
+        <w:rPr>
+          <w:rFonts w:ascii="Times New Roman" w:hAnsi="Times New Roman" w:cs="Times New Roman"/>
+          <w:color w:val="323130"/>
+          <w:sz w:val="27"/>
+          <w:szCs w:val="27"/>
+        </w:rPr>
+        <w:t>Fade</w:t>
+      </w:r>
+      <w:r>
+        <w:rPr>
+          <w:rFonts w:ascii="Times New Roman" w:hAnsi="Times New Roman" w:cs="Times New Roman"/>
+          <w:color w:val="323130"/>
+          <w:sz w:val="27"/>
+          <w:szCs w:val="27"/>
+        </w:rPr>
+        <w:t>”</w:t>
+      </w:r>
+      <w:r>
+        <w:rPr>
+          <w:rFonts w:ascii="Times New Roman" w:hAnsi="Times New Roman" w:cs="Times New Roman"/>
+          <w:color w:val="323130"/>
+          <w:sz w:val="27"/>
+          <w:szCs w:val="27"/>
+        </w:rPr>
+        <w:t xml:space="preserve"> </w:t>
+      </w:r>
+      <w:r>
+        <w:rPr>
+          <w:rFonts w:ascii="Times New Roman" w:hAnsi="Times New Roman" w:cs="Times New Roman"/>
+          <w:color w:val="323130"/>
+          <w:sz w:val="27"/>
+          <w:szCs w:val="27"/>
+        </w:rPr>
+        <w:t>command</w:t>
+      </w:r>
+      <w:r>
+        <w:rPr>
+          <w:rFonts w:ascii="Times New Roman" w:hAnsi="Times New Roman" w:cs="Times New Roman"/>
+          <w:color w:val="323130"/>
+          <w:sz w:val="27"/>
+          <w:szCs w:val="27"/>
+        </w:rPr>
+        <w:t>.</w:t>
+      </w:r>
+    </w:p>
+    <w:p>
+      <w:pPr>
+        <w:spacing w:after="240"/>
+        <w:rPr>
+          <w:rFonts w:ascii="Times New Roman" w:hAnsi="Times New Roman" w:cs="Times New Roman"/>
+          <w:color w:val="323130"/>
+          <w:sz w:val="27"/>
+          <w:szCs w:val="27"/>
+        </w:rPr>
+      </w:pPr>
+      <w:r>
+        <w:rPr>
+          <w:rFonts w:ascii="Times New Roman" w:hAnsi="Times New Roman" w:cs="Times New Roman"/>
+          <w:color w:val="323130"/>
+          <w:sz w:val="27"/>
+          <w:szCs w:val="27"/>
+        </w:rPr>
+        <w:t>If you need a sound that was faded to volume 0 to be audible again you must fade it back up to 1. It is not possible to have a sound play again by using “play” or “set” with a volume amount</w:t>
+      </w:r>
+      <w:r>
+        <w:rPr>
+          <w:rFonts w:ascii="Times New Roman" w:hAnsi="Times New Roman" w:cs="Times New Roman"/>
+          <w:color w:val="323130"/>
+          <w:sz w:val="27"/>
+          <w:szCs w:val="27"/>
+        </w:rPr>
+        <w:t xml:space="preserve"> of 1.</w:t>
+      </w:r>
+    </w:p>
+    <w:p>
+      <w:pPr>
+        <w:spacing w:after="240"/>
+        <w:rPr>
+          <w:rFonts w:ascii="Times New Roman" w:hAnsi="Times New Roman" w:cs="Times New Roman"/>
+          <w:color w:val="323130"/>
+          <w:sz w:val="27"/>
+          <w:szCs w:val="27"/>
+        </w:rPr>
+      </w:pPr>
+      <w:r>
+        <w:rPr>
+          <w:rFonts w:ascii="Times New Roman" w:hAnsi="Times New Roman" w:cs="Times New Roman"/>
+          <w:color w:val="323130"/>
+          <w:sz w:val="27"/>
+          <w:szCs w:val="27"/>
+        </w:rPr>
+        <w:t xml:space="preserve">If you need a sound to either fade back up or initially play you need to stagger the </w:t>
       </w:r>
       <w:proofErr w:type="gramStart"/>
       <w:r>
         <w:rPr>
           <w:rFonts w:ascii="Times New Roman" w:hAnsi="Times New Roman" w:cs="Times New Roman"/>
-          <w:b/>
-          <w:bCs/>
-          <w:color w:val="323130"/>
-          <w:sz w:val="27"/>
-          <w:szCs w:val="27"/>
-        </w:rPr>
-        <w:t>2023</w:t>
+          <w:color w:val="323130"/>
+          <w:sz w:val="27"/>
+          <w:szCs w:val="27"/>
+        </w:rPr>
+        <w:t>commands</w:t>
       </w:r>
       <w:proofErr w:type="gramEnd"/>
       <w:r>
         <w:rPr>
           <w:rFonts w:ascii="Times New Roman" w:hAnsi="Times New Roman" w:cs="Times New Roman"/>
-          <w:b/>
-          <w:bCs/>
-          <w:color w:val="323130"/>
-          <w:sz w:val="27"/>
-          <w:szCs w:val="27"/>
-        </w:rPr>
-        <w:t xml:space="preserve"> Need to couple play and fade if fade out goes to 0 and you need to interrupt it.</w:t>
-      </w:r>
-    </w:p>
-    <w:p>
-      <w:pPr>
-        <w:spacing w:after="240"/>
-        <w:rPr>
-          <w:rFonts w:ascii="Times New Roman" w:hAnsi="Times New Roman" w:cs="Times New Roman"/>
-          <w:color w:val="323130"/>
-          <w:sz w:val="27"/>
-          <w:szCs w:val="27"/>
-        </w:rPr>
-      </w:pPr>
-      <w:r>
-        <w:rPr>
-          <w:rFonts w:ascii="Times New Roman" w:hAnsi="Times New Roman" w:cs="Times New Roman"/>
-          <w:color w:val="323130"/>
-          <w:sz w:val="27"/>
-          <w:szCs w:val="27"/>
-        </w:rPr>
-        <w:t>This example will fade an already-playing ambient loop to 0.4 (in another command triggered earlier in the sequence, the same loop starts playing at a volume of 1):</w:t>
-      </w:r>
-    </w:p>
-    <w:p>
-      <w:pPr>
-        <w:spacing w:after="240"/>
-        <w:rPr>
-          <w:rFonts w:ascii="Times New Roman" w:hAnsi="Times New Roman" w:cs="Times New Roman"/>
-          <w:color w:val="323130"/>
-          <w:sz w:val="27"/>
-          <w:szCs w:val="27"/>
-        </w:rPr>
-      </w:pPr>
-    </w:p>
-    <w:p>
-      <w:pPr>
-        <w:spacing w:after="240"/>
-        <w:ind w:left="600"/>
-        <w:rPr>
-          <w:rFonts w:ascii="Times New Roman" w:hAnsi="Times New Roman" w:cs="Times New Roman"/>
-          <w:color w:val="323130"/>
-          <w:sz w:val="27"/>
-          <w:szCs w:val="27"/>
-        </w:rPr>
-      </w:pPr>
-      <w:r>
-        <w:rPr>
-          <w:rFonts w:ascii="Times New Roman" w:hAnsi="Times New Roman" w:cs="Times New Roman"/>
-          <w:color w:val="323130"/>
-          <w:sz w:val="27"/>
-          <w:szCs w:val="27"/>
-        </w:rPr>
-        <w:t>"onBonusGameSpinStart": [</w:t>
-      </w:r>
-    </w:p>
-    <w:p>
-      <w:pPr>
-        <w:spacing w:after="240"/>
-        <w:ind w:left="1200"/>
-        <w:rPr>
-          <w:rFonts w:ascii="Times New Roman" w:hAnsi="Times New Roman" w:cs="Times New Roman"/>
-          <w:color w:val="323130"/>
-          <w:sz w:val="27"/>
-          <w:szCs w:val="27"/>
-        </w:rPr>
-      </w:pPr>
-      <w:r>
-        <w:rPr>
-          <w:rFonts w:ascii="Times New Roman" w:hAnsi="Times New Roman" w:cs="Times New Roman"/>
-          <w:color w:val="323130"/>
-          <w:sz w:val="27"/>
-          <w:szCs w:val="27"/>
-        </w:rPr>
-        <w:t>{</w:t>
-      </w:r>
-    </w:p>
-    <w:p>
-      <w:pPr>
-        <w:spacing w:after="240"/>
-        <w:ind w:left="1200"/>
-        <w:rPr>
-          <w:rFonts w:ascii="Times New Roman" w:hAnsi="Times New Roman" w:cs="Times New Roman"/>
-          <w:color w:val="323130"/>
-          <w:sz w:val="27"/>
-          <w:szCs w:val="27"/>
-        </w:rPr>
-      </w:pPr>
-      <w:r>
-        <w:rPr>
-          <w:rFonts w:ascii="Times New Roman" w:hAnsi="Times New Roman" w:cs="Times New Roman"/>
-          <w:color w:val="323130"/>
-          <w:sz w:val="27"/>
-          <w:szCs w:val="27"/>
-        </w:rPr>
-        <w:t>"command": "Fade",</w:t>
-      </w:r>
-    </w:p>
-    <w:p>
-      <w:pPr>
-        <w:spacing w:after="240"/>
-        <w:ind w:left="1200"/>
-        <w:rPr>
-          <w:rFonts w:ascii="Times New Roman" w:hAnsi="Times New Roman" w:cs="Times New Roman"/>
-          <w:color w:val="323130"/>
-          <w:sz w:val="27"/>
-          <w:szCs w:val="27"/>
-        </w:rPr>
-      </w:pPr>
-      <w:r>
-        <w:rPr>
-          <w:rFonts w:ascii="Times New Roman" w:hAnsi="Times New Roman" w:cs="Times New Roman"/>
-          <w:color w:val="323130"/>
-          <w:sz w:val="27"/>
-          <w:szCs w:val="27"/>
-        </w:rPr>
-        <w:t>"</w:t>
-      </w:r>
-      <w:proofErr w:type="spellStart"/>
-      <w:r>
-        <w:rPr>
-          <w:rFonts w:ascii="Times New Roman" w:hAnsi="Times New Roman" w:cs="Times New Roman"/>
-          <w:color w:val="323130"/>
-          <w:sz w:val="27"/>
-          <w:szCs w:val="27"/>
-        </w:rPr>
-        <w:t>spriteId</w:t>
-      </w:r>
-      <w:proofErr w:type="spellEnd"/>
-      <w:r>
-        <w:rPr>
-          <w:rFonts w:ascii="Times New Roman" w:hAnsi="Times New Roman" w:cs="Times New Roman"/>
-          <w:color w:val="323130"/>
-          <w:sz w:val="27"/>
-          <w:szCs w:val="27"/>
-        </w:rPr>
-        <w:t>": "</w:t>
-      </w:r>
-      <w:proofErr w:type="spellStart"/>
-      <w:r>
-        <w:rPr>
-          <w:rFonts w:ascii="Times New Roman" w:hAnsi="Times New Roman" w:cs="Times New Roman"/>
-          <w:color w:val="323130"/>
-          <w:sz w:val="27"/>
-          <w:szCs w:val="27"/>
-        </w:rPr>
-        <w:t>s_TOF_FreeSpinPickerAmbience</w:t>
-      </w:r>
-      <w:proofErr w:type="spellEnd"/>
-      <w:r>
-        <w:rPr>
-          <w:rFonts w:ascii="Times New Roman" w:hAnsi="Times New Roman" w:cs="Times New Roman"/>
-          <w:color w:val="323130"/>
-          <w:sz w:val="27"/>
-          <w:szCs w:val="27"/>
-        </w:rPr>
-        <w:t>",</w:t>
-      </w:r>
-    </w:p>
-    <w:p>
-      <w:pPr>
-        <w:spacing w:after="240"/>
-        <w:ind w:left="1200"/>
-        <w:rPr>
-          <w:rFonts w:ascii="Times New Roman" w:hAnsi="Times New Roman" w:cs="Times New Roman"/>
-          <w:color w:val="323130"/>
-          <w:sz w:val="27"/>
-          <w:szCs w:val="27"/>
-        </w:rPr>
-      </w:pPr>
-      <w:r>
-        <w:rPr>
-          <w:rFonts w:ascii="Times New Roman" w:hAnsi="Times New Roman" w:cs="Times New Roman"/>
-          <w:color w:val="323130"/>
-          <w:sz w:val="27"/>
-          <w:szCs w:val="27"/>
-        </w:rPr>
-        <w:t>"volume": 0.4,</w:t>
-      </w:r>
-    </w:p>
-    <w:p>
-      <w:pPr>
-        <w:spacing w:after="240"/>
-        <w:ind w:left="1200"/>
-        <w:rPr>
-          <w:rFonts w:ascii="Times New Roman" w:hAnsi="Times New Roman" w:cs="Times New Roman"/>
-          <w:color w:val="323130"/>
-          <w:sz w:val="27"/>
-          <w:szCs w:val="27"/>
-        </w:rPr>
-      </w:pPr>
-      <w:r>
-        <w:rPr>
-          <w:rFonts w:ascii="Times New Roman" w:hAnsi="Times New Roman" w:cs="Times New Roman"/>
-          <w:color w:val="323130"/>
-          <w:sz w:val="27"/>
-          <w:szCs w:val="27"/>
-        </w:rPr>
-        <w:t>"duration": 1000</w:t>
-      </w:r>
-    </w:p>
-    <w:p>
-      <w:pPr>
-        <w:spacing w:after="240"/>
-        <w:ind w:left="1200"/>
-        <w:rPr>
-          <w:rFonts w:ascii="Times New Roman" w:hAnsi="Times New Roman" w:cs="Times New Roman"/>
-          <w:color w:val="323130"/>
-          <w:sz w:val="27"/>
-          <w:szCs w:val="27"/>
-        </w:rPr>
-      </w:pPr>
-      <w:r>
-        <w:rPr>
-          <w:rFonts w:ascii="Times New Roman" w:hAnsi="Times New Roman" w:cs="Times New Roman"/>
-          <w:color w:val="323130"/>
-          <w:sz w:val="27"/>
-          <w:szCs w:val="27"/>
-        </w:rPr>
-        <w:t>}</w:t>
-      </w:r>
-    </w:p>
-    <w:p>
-      <w:pPr>
-        <w:spacing w:after="240"/>
-        <w:ind w:left="600"/>
-        <w:rPr>
-          <w:rFonts w:ascii="Times New Roman" w:hAnsi="Times New Roman" w:cs="Times New Roman"/>
-          <w:color w:val="323130"/>
-          <w:sz w:val="27"/>
-          <w:szCs w:val="27"/>
-        </w:rPr>
-      </w:pPr>
-      <w:r>
-        <w:rPr>
-          <w:rFonts w:ascii="Times New Roman" w:hAnsi="Times New Roman" w:cs="Times New Roman"/>
-          <w:color w:val="323130"/>
-          <w:sz w:val="27"/>
-          <w:szCs w:val="27"/>
-        </w:rPr>
-        <w:t>],</w:t>
-      </w:r>
-    </w:p>
-    <w:p>
-      <w:pPr>
-        <w:spacing w:after="240"/>
-        <w:ind w:left="600"/>
-        <w:rPr>
-          <w:rFonts w:ascii="Times New Roman" w:hAnsi="Times New Roman" w:cs="Times New Roman"/>
-          <w:color w:val="323130"/>
-          <w:sz w:val="27"/>
-          <w:szCs w:val="27"/>
-        </w:rPr>
-      </w:pPr>
-    </w:p>
-    <w:p>
-      <w:pPr>
-        <w:spacing w:after="240"/>
-        <w:rPr>
-          <w:rFonts w:ascii="Times New Roman" w:hAnsi="Times New Roman" w:cs="Times New Roman"/>
-          <w:color w:val="323130"/>
-          <w:sz w:val="27"/>
-          <w:szCs w:val="27"/>
-        </w:rPr>
-      </w:pPr>
-      <w:r>
-        <w:rPr>
-          <w:rFonts w:ascii="Times New Roman" w:hAnsi="Times New Roman" w:cs="Times New Roman"/>
-          <w:color w:val="323130"/>
-          <w:sz w:val="27"/>
-          <w:szCs w:val="27"/>
-        </w:rPr>
-        <w:t>This example will play a transition SFX, and also fade and stop the base game's background music loop:</w:t>
-      </w:r>
-    </w:p>
-    <w:p>
-      <w:pPr>
-        <w:spacing w:after="240"/>
-        <w:rPr>
-          <w:rFonts w:ascii="Times New Roman" w:hAnsi="Times New Roman" w:cs="Times New Roman"/>
-          <w:color w:val="323130"/>
-          <w:sz w:val="27"/>
-          <w:szCs w:val="27"/>
-        </w:rPr>
-      </w:pPr>
-    </w:p>
-    <w:p>
-      <w:pPr>
-        <w:spacing w:after="240"/>
-        <w:ind w:left="600"/>
-        <w:rPr>
-          <w:rFonts w:ascii="Times New Roman" w:hAnsi="Times New Roman" w:cs="Times New Roman"/>
-          <w:color w:val="323130"/>
-          <w:sz w:val="27"/>
-          <w:szCs w:val="27"/>
-        </w:rPr>
-      </w:pPr>
-      <w:r>
-        <w:rPr>
-          <w:rFonts w:ascii="Times New Roman" w:hAnsi="Times New Roman" w:cs="Times New Roman"/>
-          <w:color w:val="323130"/>
-          <w:sz w:val="27"/>
-          <w:szCs w:val="27"/>
-        </w:rPr>
-        <w:t>"</w:t>
-      </w:r>
-      <w:proofErr w:type="spellStart"/>
-      <w:r>
-        <w:rPr>
-          <w:rFonts w:ascii="Times New Roman" w:hAnsi="Times New Roman" w:cs="Times New Roman"/>
-          <w:color w:val="323130"/>
-          <w:sz w:val="27"/>
-          <w:szCs w:val="27"/>
-        </w:rPr>
-        <w:t>onFireTransitionStart</w:t>
-      </w:r>
-      <w:proofErr w:type="spellEnd"/>
-      <w:r>
-        <w:rPr>
-          <w:rFonts w:ascii="Times New Roman" w:hAnsi="Times New Roman" w:cs="Times New Roman"/>
-          <w:color w:val="323130"/>
-          <w:sz w:val="27"/>
-          <w:szCs w:val="27"/>
-        </w:rPr>
-        <w:t>": [</w:t>
-      </w:r>
-    </w:p>
-    <w:p>
-      <w:pPr>
-        <w:spacing w:after="240"/>
-        <w:ind w:left="1200"/>
-        <w:rPr>
-          <w:rFonts w:ascii="Times New Roman" w:hAnsi="Times New Roman" w:cs="Times New Roman"/>
-          <w:color w:val="323130"/>
-          <w:sz w:val="27"/>
-          <w:szCs w:val="27"/>
-        </w:rPr>
-      </w:pPr>
-      <w:r>
-        <w:rPr>
-          <w:rFonts w:ascii="Times New Roman" w:hAnsi="Times New Roman" w:cs="Times New Roman"/>
-          <w:color w:val="323130"/>
-          <w:sz w:val="27"/>
-          <w:szCs w:val="27"/>
-        </w:rPr>
-        <w:t>{</w:t>
-      </w:r>
-    </w:p>
-    <w:p>
-      <w:pPr>
-        <w:spacing w:after="240"/>
-        <w:ind w:left="1200"/>
-        <w:rPr>
-          <w:rFonts w:ascii="Times New Roman" w:hAnsi="Times New Roman" w:cs="Times New Roman"/>
-          <w:color w:val="323130"/>
-          <w:sz w:val="27"/>
-          <w:szCs w:val="27"/>
-        </w:rPr>
-      </w:pPr>
-      <w:r>
-        <w:rPr>
-          <w:rFonts w:ascii="Times New Roman" w:hAnsi="Times New Roman" w:cs="Times New Roman"/>
-          <w:color w:val="323130"/>
-          <w:sz w:val="27"/>
-          <w:szCs w:val="27"/>
-        </w:rPr>
-        <w:t>"command": "Play",</w:t>
-      </w:r>
-    </w:p>
-    <w:p>
-      <w:pPr>
-        <w:spacing w:after="240"/>
-        <w:ind w:left="1200"/>
-        <w:rPr>
-          <w:rFonts w:ascii="Times New Roman" w:hAnsi="Times New Roman" w:cs="Times New Roman"/>
-          <w:color w:val="323130"/>
-          <w:sz w:val="27"/>
-          <w:szCs w:val="27"/>
-        </w:rPr>
-      </w:pPr>
-      <w:r>
-        <w:rPr>
-          <w:rFonts w:ascii="Times New Roman" w:hAnsi="Times New Roman" w:cs="Times New Roman"/>
-          <w:color w:val="323130"/>
-          <w:sz w:val="27"/>
-          <w:szCs w:val="27"/>
-        </w:rPr>
-        <w:t>"</w:t>
-      </w:r>
-      <w:proofErr w:type="spellStart"/>
-      <w:r>
-        <w:rPr>
-          <w:rFonts w:ascii="Times New Roman" w:hAnsi="Times New Roman" w:cs="Times New Roman"/>
-          <w:color w:val="323130"/>
-          <w:sz w:val="27"/>
-          <w:szCs w:val="27"/>
-        </w:rPr>
-        <w:t>spriteId</w:t>
-      </w:r>
-      <w:proofErr w:type="spellEnd"/>
-      <w:r>
-        <w:rPr>
-          <w:rFonts w:ascii="Times New Roman" w:hAnsi="Times New Roman" w:cs="Times New Roman"/>
-          <w:color w:val="323130"/>
-          <w:sz w:val="27"/>
-          <w:szCs w:val="27"/>
-        </w:rPr>
-        <w:t>": "</w:t>
-      </w:r>
-      <w:proofErr w:type="spellStart"/>
-      <w:r>
-        <w:rPr>
-          <w:rFonts w:ascii="Times New Roman" w:hAnsi="Times New Roman" w:cs="Times New Roman"/>
-          <w:color w:val="323130"/>
-          <w:sz w:val="27"/>
-          <w:szCs w:val="27"/>
-        </w:rPr>
-        <w:t>s_TOF_FireTransition</w:t>
-      </w:r>
-      <w:proofErr w:type="spellEnd"/>
-      <w:r>
-        <w:rPr>
-          <w:rFonts w:ascii="Times New Roman" w:hAnsi="Times New Roman" w:cs="Times New Roman"/>
-          <w:color w:val="323130"/>
-          <w:sz w:val="27"/>
-          <w:szCs w:val="27"/>
-        </w:rPr>
-        <w:t>"</w:t>
-      </w:r>
-    </w:p>
-    <w:p>
-      <w:pPr>
-        <w:spacing w:after="240"/>
-        <w:ind w:left="1200"/>
-        <w:rPr>
-          <w:rFonts w:ascii="Times New Roman" w:hAnsi="Times New Roman" w:cs="Times New Roman"/>
-          <w:color w:val="323130"/>
-          <w:sz w:val="27"/>
-          <w:szCs w:val="27"/>
-        </w:rPr>
-      </w:pPr>
-      <w:r>
-        <w:rPr>
-          <w:rFonts w:ascii="Times New Roman" w:hAnsi="Times New Roman" w:cs="Times New Roman"/>
-          <w:color w:val="323130"/>
-          <w:sz w:val="27"/>
-          <w:szCs w:val="27"/>
-        </w:rPr>
-        <w:t>},</w:t>
-      </w:r>
-    </w:p>
-    <w:p>
-      <w:pPr>
-        <w:spacing w:after="240"/>
-        <w:ind w:left="1200"/>
-        <w:rPr>
-          <w:rFonts w:ascii="Times New Roman" w:hAnsi="Times New Roman" w:cs="Times New Roman"/>
-          <w:color w:val="323130"/>
-          <w:sz w:val="27"/>
-          <w:szCs w:val="27"/>
-        </w:rPr>
-      </w:pPr>
-      <w:r>
-        <w:rPr>
-          <w:rFonts w:ascii="Times New Roman" w:hAnsi="Times New Roman" w:cs="Times New Roman"/>
-          <w:color w:val="323130"/>
-          <w:sz w:val="27"/>
-          <w:szCs w:val="27"/>
-        </w:rPr>
-        <w:t>{</w:t>
-      </w:r>
-    </w:p>
-    <w:p>
-      <w:pPr>
-        <w:spacing w:after="240"/>
-        <w:ind w:left="1200"/>
-        <w:rPr>
-          <w:rFonts w:ascii="Times New Roman" w:hAnsi="Times New Roman" w:cs="Times New Roman"/>
-          <w:color w:val="323130"/>
-          <w:sz w:val="27"/>
-          <w:szCs w:val="27"/>
-        </w:rPr>
-      </w:pPr>
-      <w:r>
-        <w:rPr>
-          <w:rFonts w:ascii="Times New Roman" w:hAnsi="Times New Roman" w:cs="Times New Roman"/>
-          <w:color w:val="323130"/>
-          <w:sz w:val="27"/>
-          <w:szCs w:val="27"/>
-        </w:rPr>
-        <w:t>"command": "Fade",</w:t>
-      </w:r>
-    </w:p>
-    <w:p>
-      <w:pPr>
-        <w:spacing w:after="240"/>
-        <w:ind w:left="1200"/>
+          <w:color w:val="323130"/>
+          <w:sz w:val="27"/>
+          <w:szCs w:val="27"/>
+        </w:rPr>
+        <w:t xml:space="preserve"> or they will not work. For </w:t>
+      </w:r>
+      <w:r>
+        <w:rPr>
+          <w:rFonts w:ascii="Times New Roman" w:hAnsi="Times New Roman" w:cs="Times New Roman"/>
+          <w:color w:val="323130"/>
+          <w:sz w:val="27"/>
+          <w:szCs w:val="27"/>
+        </w:rPr>
+        <w:t>example,</w:t>
+      </w:r>
+      <w:r>
+        <w:rPr>
+          <w:rFonts w:ascii="Times New Roman" w:hAnsi="Times New Roman" w:cs="Times New Roman"/>
+          <w:color w:val="323130"/>
+          <w:sz w:val="27"/>
+          <w:szCs w:val="27"/>
+        </w:rPr>
+        <w:t xml:space="preserve"> </w:t>
+      </w:r>
+      <w:r>
+        <w:rPr>
+          <w:rFonts w:ascii="Times New Roman" w:hAnsi="Times New Roman" w:cs="Times New Roman"/>
+          <w:color w:val="323130"/>
+          <w:sz w:val="27"/>
+          <w:szCs w:val="27"/>
+        </w:rPr>
+        <w:t>the base game music loop is faded to 0 by the inactivity timer</w:t>
+      </w:r>
+      <w:r>
+        <w:rPr>
+          <w:rFonts w:ascii="Times New Roman" w:hAnsi="Times New Roman" w:cs="Times New Roman"/>
+          <w:color w:val="323130"/>
+          <w:sz w:val="27"/>
+          <w:szCs w:val="27"/>
+        </w:rPr>
+        <w:t xml:space="preserve"> (or is in the process of fading to 0)</w:t>
+      </w:r>
+      <w:r>
+        <w:rPr>
+          <w:rFonts w:ascii="Times New Roman" w:hAnsi="Times New Roman" w:cs="Times New Roman"/>
+          <w:color w:val="323130"/>
+          <w:sz w:val="27"/>
+          <w:szCs w:val="27"/>
+        </w:rPr>
+        <w:t xml:space="preserve">, you will need to do something like this: </w:t>
+      </w:r>
+    </w:p>
+    <w:p>
+      <w:pPr>
+        <w:spacing w:after="240"/>
+        <w:rPr>
+          <w:rFonts w:ascii="Times New Roman" w:hAnsi="Times New Roman" w:cs="Times New Roman"/>
+          <w:color w:val="323130"/>
+          <w:sz w:val="27"/>
+          <w:szCs w:val="27"/>
+        </w:rPr>
+      </w:pPr>
+    </w:p>
+    <w:p>
+      <w:pPr>
+        <w:spacing w:after="240"/>
+        <w:rPr>
+          <w:rFonts w:ascii="Times New Roman" w:hAnsi="Times New Roman" w:cs="Times New Roman"/>
+          <w:color w:val="323130"/>
+          <w:sz w:val="27"/>
+          <w:szCs w:val="27"/>
+        </w:rPr>
+      </w:pPr>
+    </w:p>
+    <w:p>
+      <w:pPr>
+        <w:spacing w:after="240"/>
+        <w:rPr>
+          <w:rFonts w:ascii="Times New Roman" w:hAnsi="Times New Roman" w:cs="Times New Roman"/>
+          <w:color w:val="323130"/>
+          <w:sz w:val="27"/>
+          <w:szCs w:val="27"/>
+        </w:rPr>
+      </w:pPr>
+    </w:p>
+    <w:p>
+      <w:pPr>
+        <w:spacing w:after="240"/>
         <w:rPr>
           <w:rFonts w:ascii="Times New Roman" w:hAnsi="Times New Roman" w:cs="Times New Roman"/>
           <w:color w:val="323130"/>
@@ -3567,278 +3857,201 @@
           <w:sz w:val="27"/>
           <w:szCs w:val="27"/>
         </w:rPr>
-        <w:t>spriteId</w:t>
-      </w:r>
-      <w:proofErr w:type="spellEnd"/>
-      <w:r>
-        <w:rPr>
-          <w:rFonts w:ascii="Times New Roman" w:hAnsi="Times New Roman" w:cs="Times New Roman"/>
-          <w:color w:val="323130"/>
-          <w:sz w:val="27"/>
-          <w:szCs w:val="27"/>
-        </w:rPr>
-        <w:t>": "</w:t>
-      </w:r>
-      <w:proofErr w:type="spellStart"/>
-      <w:r>
-        <w:rPr>
-          <w:rFonts w:ascii="Times New Roman" w:hAnsi="Times New Roman" w:cs="Times New Roman"/>
-          <w:color w:val="323130"/>
-          <w:sz w:val="27"/>
-          <w:szCs w:val="27"/>
-        </w:rPr>
-        <w:t>s_TOF_BaseGameMusicLoop</w:t>
-      </w:r>
-      <w:proofErr w:type="spellEnd"/>
-      <w:r>
-        <w:rPr>
-          <w:rFonts w:ascii="Times New Roman" w:hAnsi="Times New Roman" w:cs="Times New Roman"/>
-          <w:color w:val="323130"/>
-          <w:sz w:val="27"/>
-          <w:szCs w:val="27"/>
-        </w:rPr>
-        <w:t>",</w:t>
-      </w:r>
-    </w:p>
-    <w:p>
-      <w:pPr>
-        <w:spacing w:after="240"/>
-        <w:ind w:left="1200"/>
-        <w:rPr>
-          <w:rFonts w:ascii="Times New Roman" w:hAnsi="Times New Roman" w:cs="Times New Roman"/>
-          <w:color w:val="323130"/>
-          <w:sz w:val="27"/>
-          <w:szCs w:val="27"/>
-        </w:rPr>
-      </w:pPr>
-      <w:r>
-        <w:rPr>
-          <w:rFonts w:ascii="Times New Roman" w:hAnsi="Times New Roman" w:cs="Times New Roman"/>
-          <w:color w:val="323130"/>
-          <w:sz w:val="27"/>
-          <w:szCs w:val="27"/>
-        </w:rPr>
-        <w:t>"volume": 0.0,</w:t>
-      </w:r>
-    </w:p>
-    <w:p>
-      <w:pPr>
-        <w:spacing w:after="240"/>
-        <w:ind w:left="1200"/>
-        <w:rPr>
-          <w:rFonts w:ascii="Times New Roman" w:hAnsi="Times New Roman" w:cs="Times New Roman"/>
-          <w:color w:val="323130"/>
-          <w:sz w:val="27"/>
-          <w:szCs w:val="27"/>
-        </w:rPr>
-      </w:pPr>
-      <w:r>
-        <w:rPr>
-          <w:rFonts w:ascii="Times New Roman" w:hAnsi="Times New Roman" w:cs="Times New Roman"/>
-          <w:color w:val="323130"/>
-          <w:sz w:val="27"/>
-          <w:szCs w:val="27"/>
-        </w:rPr>
-        <w:t>"duration": 3000</w:t>
-      </w:r>
-    </w:p>
-    <w:p>
-      <w:pPr>
-        <w:spacing w:after="240"/>
-        <w:ind w:left="1200"/>
-        <w:rPr>
-          <w:rFonts w:ascii="Times New Roman" w:hAnsi="Times New Roman" w:cs="Times New Roman"/>
-          <w:color w:val="323130"/>
-          <w:sz w:val="27"/>
-          <w:szCs w:val="27"/>
-        </w:rPr>
-      </w:pPr>
-      <w:r>
-        <w:rPr>
-          <w:rFonts w:ascii="Times New Roman" w:hAnsi="Times New Roman" w:cs="Times New Roman"/>
-          <w:color w:val="323130"/>
-          <w:sz w:val="27"/>
-          <w:szCs w:val="27"/>
-        </w:rPr>
-        <w:t>},</w:t>
-      </w:r>
-    </w:p>
-    <w:p>
-      <w:pPr>
-        <w:spacing w:after="240"/>
-        <w:ind w:left="1200"/>
-        <w:rPr>
-          <w:rFonts w:ascii="Times New Roman" w:hAnsi="Times New Roman" w:cs="Times New Roman"/>
-          <w:color w:val="323130"/>
-          <w:sz w:val="27"/>
-          <w:szCs w:val="27"/>
-        </w:rPr>
-      </w:pPr>
-      <w:r>
-        <w:rPr>
-          <w:rFonts w:ascii="Times New Roman" w:hAnsi="Times New Roman" w:cs="Times New Roman"/>
-          <w:color w:val="323130"/>
-          <w:sz w:val="27"/>
-          <w:szCs w:val="27"/>
-        </w:rPr>
-        <w:t>{</w:t>
-      </w:r>
-    </w:p>
-    <w:p>
-      <w:pPr>
-        <w:spacing w:after="240"/>
-        <w:ind w:left="1200"/>
-        <w:rPr>
-          <w:rFonts w:ascii="Times New Roman" w:hAnsi="Times New Roman" w:cs="Times New Roman"/>
-          <w:color w:val="323130"/>
-          <w:sz w:val="27"/>
-          <w:szCs w:val="27"/>
-        </w:rPr>
-      </w:pPr>
-      <w:r>
-        <w:rPr>
-          <w:rFonts w:ascii="Times New Roman" w:hAnsi="Times New Roman" w:cs="Times New Roman"/>
-          <w:color w:val="323130"/>
-          <w:sz w:val="27"/>
-          <w:szCs w:val="27"/>
-        </w:rPr>
-        <w:t>"command": "Stop",</w:t>
-      </w:r>
-    </w:p>
-    <w:p>
-      <w:pPr>
-        <w:spacing w:after="240"/>
-        <w:ind w:left="1200"/>
-        <w:rPr>
-          <w:rFonts w:ascii="Times New Roman" w:hAnsi="Times New Roman" w:cs="Times New Roman"/>
-          <w:color w:val="323130"/>
-          <w:sz w:val="27"/>
-          <w:szCs w:val="27"/>
-        </w:rPr>
-      </w:pPr>
-      <w:r>
-        <w:rPr>
-          <w:rFonts w:ascii="Times New Roman" w:hAnsi="Times New Roman" w:cs="Times New Roman"/>
-          <w:color w:val="323130"/>
-          <w:sz w:val="27"/>
-          <w:szCs w:val="27"/>
-        </w:rPr>
-        <w:t>"</w:t>
-      </w:r>
-      <w:proofErr w:type="spellStart"/>
-      <w:r>
-        <w:rPr>
-          <w:rFonts w:ascii="Times New Roman" w:hAnsi="Times New Roman" w:cs="Times New Roman"/>
-          <w:color w:val="323130"/>
-          <w:sz w:val="27"/>
-          <w:szCs w:val="27"/>
-        </w:rPr>
-        <w:t>spriteId</w:t>
-      </w:r>
-      <w:proofErr w:type="spellEnd"/>
-      <w:r>
-        <w:rPr>
-          <w:rFonts w:ascii="Times New Roman" w:hAnsi="Times New Roman" w:cs="Times New Roman"/>
-          <w:color w:val="323130"/>
-          <w:sz w:val="27"/>
-          <w:szCs w:val="27"/>
-        </w:rPr>
-        <w:t>": "</w:t>
-      </w:r>
-      <w:proofErr w:type="spellStart"/>
-      <w:r>
-        <w:rPr>
-          <w:rFonts w:ascii="Times New Roman" w:hAnsi="Times New Roman" w:cs="Times New Roman"/>
-          <w:color w:val="323130"/>
-          <w:sz w:val="27"/>
-          <w:szCs w:val="27"/>
-        </w:rPr>
-        <w:t>s_TOF_BaseGameMusicLoop</w:t>
-      </w:r>
-      <w:proofErr w:type="spellEnd"/>
-      <w:r>
-        <w:rPr>
-          <w:rFonts w:ascii="Times New Roman" w:hAnsi="Times New Roman" w:cs="Times New Roman"/>
-          <w:color w:val="323130"/>
-          <w:sz w:val="27"/>
-          <w:szCs w:val="27"/>
-        </w:rPr>
-        <w:t>",</w:t>
-      </w:r>
-    </w:p>
-    <w:p>
-      <w:pPr>
-        <w:spacing w:after="240"/>
-        <w:ind w:left="1200"/>
-        <w:rPr>
-          <w:rFonts w:ascii="Times New Roman" w:hAnsi="Times New Roman" w:cs="Times New Roman"/>
-          <w:color w:val="323130"/>
-          <w:sz w:val="27"/>
-          <w:szCs w:val="27"/>
-        </w:rPr>
-      </w:pPr>
-      <w:r>
-        <w:rPr>
-          <w:rFonts w:ascii="Times New Roman" w:hAnsi="Times New Roman" w:cs="Times New Roman"/>
-          <w:color w:val="323130"/>
-          <w:sz w:val="27"/>
-          <w:szCs w:val="27"/>
-        </w:rPr>
-        <w:t>"delay": 3100</w:t>
-      </w:r>
-    </w:p>
-    <w:p>
-      <w:pPr>
-        <w:spacing w:after="240"/>
-        <w:ind w:left="1200"/>
-        <w:rPr>
-          <w:rFonts w:ascii="Times New Roman" w:hAnsi="Times New Roman" w:cs="Times New Roman"/>
-          <w:color w:val="323130"/>
-          <w:sz w:val="27"/>
-          <w:szCs w:val="27"/>
-        </w:rPr>
-      </w:pPr>
-      <w:r>
-        <w:rPr>
-          <w:rFonts w:ascii="Times New Roman" w:hAnsi="Times New Roman" w:cs="Times New Roman"/>
-          <w:color w:val="323130"/>
-          <w:sz w:val="27"/>
-          <w:szCs w:val="27"/>
-        </w:rPr>
-        <w:t>}</w:t>
-      </w:r>
-    </w:p>
-    <w:p>
-      <w:pPr>
-        <w:spacing w:after="240"/>
-        <w:ind w:left="600"/>
-        <w:rPr>
-          <w:rFonts w:ascii="Times New Roman" w:hAnsi="Times New Roman" w:cs="Times New Roman"/>
-          <w:color w:val="323130"/>
-          <w:sz w:val="27"/>
-          <w:szCs w:val="27"/>
-        </w:rPr>
-      </w:pPr>
-      <w:r>
-        <w:rPr>
-          <w:rFonts w:ascii="Times New Roman" w:hAnsi="Times New Roman" w:cs="Times New Roman"/>
-          <w:color w:val="323130"/>
-          <w:sz w:val="27"/>
-          <w:szCs w:val="27"/>
-        </w:rPr>
-        <w:t>],</w:t>
-      </w:r>
-    </w:p>
-    <w:p>
-      <w:pPr>
-        <w:spacing w:after="240"/>
-        <w:rPr>
-          <w:rFonts w:ascii="Times New Roman" w:hAnsi="Times New Roman" w:cs="Times New Roman"/>
-          <w:color w:val="323130"/>
-          <w:sz w:val="27"/>
-          <w:szCs w:val="27"/>
-        </w:rPr>
-      </w:pPr>
+        <w:t>onBaseSpinStart</w:t>
+      </w:r>
+      <w:proofErr w:type="spellEnd"/>
+      <w:proofErr w:type="gramStart"/>
+      <w:r>
+        <w:rPr>
+          <w:rFonts w:ascii="Times New Roman" w:hAnsi="Times New Roman" w:cs="Times New Roman"/>
+          <w:color w:val="323130"/>
+          <w:sz w:val="27"/>
+          <w:szCs w:val="27"/>
+        </w:rPr>
+        <w:t>":[</w:t>
+      </w:r>
+      <w:proofErr w:type="gramEnd"/>
+    </w:p>
+    <w:p>
+      <w:pPr>
+        <w:spacing w:after="240"/>
+        <w:rPr>
+          <w:rFonts w:ascii="Times New Roman" w:hAnsi="Times New Roman" w:cs="Times New Roman"/>
+          <w:color w:val="323130"/>
+          <w:sz w:val="27"/>
+          <w:szCs w:val="27"/>
+        </w:rPr>
+      </w:pPr>
+      <w:r>
+        <w:rPr>
+          <w:rFonts w:ascii="Times New Roman" w:hAnsi="Times New Roman" w:cs="Times New Roman"/>
+          <w:color w:val="323130"/>
+          <w:sz w:val="27"/>
+          <w:szCs w:val="27"/>
+        </w:rPr>
+        <w:tab/>
+        <w:t>{"command":"Play","spriteId":"s_BaseMusicLoop","volume":1,"loop</w:t>
+      </w:r>
+      <w:proofErr w:type="gramStart"/>
+      <w:r>
+        <w:rPr>
+          <w:rFonts w:ascii="Times New Roman" w:hAnsi="Times New Roman" w:cs="Times New Roman"/>
+          <w:color w:val="323130"/>
+          <w:sz w:val="27"/>
+          <w:szCs w:val="27"/>
+        </w:rPr>
+        <w:t>":-</w:t>
+      </w:r>
+      <w:proofErr w:type="gramEnd"/>
+      <w:r>
+        <w:rPr>
+          <w:rFonts w:ascii="Times New Roman" w:hAnsi="Times New Roman" w:cs="Times New Roman"/>
+          <w:color w:val="323130"/>
+          <w:sz w:val="27"/>
+          <w:szCs w:val="27"/>
+        </w:rPr>
+        <w:t>1},</w:t>
+      </w:r>
+    </w:p>
+    <w:p>
+      <w:pPr>
+        <w:spacing w:after="240"/>
+        <w:rPr>
+          <w:rFonts w:ascii="Times New Roman" w:hAnsi="Times New Roman" w:cs="Times New Roman"/>
+          <w:color w:val="323130"/>
+          <w:sz w:val="27"/>
+          <w:szCs w:val="27"/>
+        </w:rPr>
+      </w:pPr>
+      <w:r>
+        <w:rPr>
+          <w:rFonts w:ascii="Times New Roman" w:hAnsi="Times New Roman" w:cs="Times New Roman"/>
+          <w:color w:val="323130"/>
+          <w:sz w:val="27"/>
+          <w:szCs w:val="27"/>
+        </w:rPr>
+        <w:tab/>
+        <w:t>{"command":"Fade","spriteId":"s_BaseMusicLoop","volume":1,"duration":100,"delay":50}</w:t>
+      </w:r>
+    </w:p>
+    <w:p>
+      <w:pPr>
+        <w:spacing w:after="240"/>
+        <w:rPr>
+          <w:rFonts w:ascii="Times New Roman" w:hAnsi="Times New Roman" w:cs="Times New Roman"/>
+          <w:color w:val="323130"/>
+          <w:sz w:val="27"/>
+          <w:szCs w:val="27"/>
+        </w:rPr>
+      </w:pPr>
+      <w:r>
+        <w:rPr>
+          <w:rFonts w:ascii="Times New Roman" w:hAnsi="Times New Roman" w:cs="Times New Roman"/>
+          <w:color w:val="323130"/>
+          <w:sz w:val="27"/>
+          <w:szCs w:val="27"/>
+        </w:rPr>
+        <w:t xml:space="preserve">Note that the fade command is 50ms after the Play command. </w:t>
+      </w:r>
+      <w:r>
+        <w:rPr>
+          <w:rFonts w:ascii="Times New Roman" w:hAnsi="Times New Roman" w:cs="Times New Roman"/>
+          <w:color w:val="323130"/>
+          <w:sz w:val="27"/>
+          <w:szCs w:val="27"/>
+        </w:rPr>
+        <w:t xml:space="preserve">You must do this. </w:t>
+      </w:r>
+      <w:r>
+        <w:rPr>
+          <w:rFonts w:ascii="Times New Roman" w:hAnsi="Times New Roman" w:cs="Times New Roman"/>
+          <w:color w:val="323130"/>
+          <w:sz w:val="27"/>
+          <w:szCs w:val="27"/>
+        </w:rPr>
+        <w:t xml:space="preserve">This way if the sound is played on game startup or after </w:t>
+      </w:r>
+      <w:r>
+        <w:rPr>
+          <w:rFonts w:ascii="Times New Roman" w:hAnsi="Times New Roman" w:cs="Times New Roman"/>
+          <w:color w:val="323130"/>
+          <w:sz w:val="27"/>
+          <w:szCs w:val="27"/>
+        </w:rPr>
+        <w:t>it was stopped</w:t>
+      </w:r>
+      <w:r>
+        <w:rPr>
+          <w:rFonts w:ascii="Times New Roman" w:hAnsi="Times New Roman" w:cs="Times New Roman"/>
+          <w:color w:val="323130"/>
+          <w:sz w:val="27"/>
+          <w:szCs w:val="27"/>
+        </w:rPr>
+        <w:t xml:space="preserve"> then it will play the sound and the fade command will do nothing</w:t>
+      </w:r>
+      <w:r>
+        <w:rPr>
+          <w:rFonts w:ascii="Times New Roman" w:hAnsi="Times New Roman" w:cs="Times New Roman"/>
+          <w:color w:val="323130"/>
+          <w:sz w:val="27"/>
+          <w:szCs w:val="27"/>
+        </w:rPr>
+        <w:t>. I</w:t>
+      </w:r>
+      <w:r>
+        <w:rPr>
+          <w:rFonts w:ascii="Times New Roman" w:hAnsi="Times New Roman" w:cs="Times New Roman"/>
+          <w:color w:val="323130"/>
+          <w:sz w:val="27"/>
+          <w:szCs w:val="27"/>
+        </w:rPr>
+        <w:t xml:space="preserve">f the </w:t>
+      </w:r>
+      <w:r>
+        <w:rPr>
+          <w:rFonts w:ascii="Times New Roman" w:hAnsi="Times New Roman" w:cs="Times New Roman"/>
+          <w:color w:val="323130"/>
+          <w:sz w:val="27"/>
+          <w:szCs w:val="27"/>
+        </w:rPr>
+        <w:t>sound</w:t>
+      </w:r>
+      <w:r>
+        <w:rPr>
+          <w:rFonts w:ascii="Times New Roman" w:hAnsi="Times New Roman" w:cs="Times New Roman"/>
+          <w:color w:val="323130"/>
+          <w:sz w:val="27"/>
+          <w:szCs w:val="27"/>
+        </w:rPr>
+        <w:t xml:space="preserve"> was faded down to 0 (or is in the process of fading down) the play command will do nothing and the fade command</w:t>
+      </w:r>
+      <w:r>
+        <w:rPr>
+          <w:rFonts w:ascii="Times New Roman" w:hAnsi="Times New Roman" w:cs="Times New Roman"/>
+          <w:color w:val="323130"/>
+          <w:sz w:val="27"/>
+          <w:szCs w:val="27"/>
+        </w:rPr>
+        <w:t xml:space="preserve"> will</w:t>
+      </w:r>
+      <w:r>
+        <w:rPr>
+          <w:rFonts w:ascii="Times New Roman" w:hAnsi="Times New Roman" w:cs="Times New Roman"/>
+          <w:color w:val="323130"/>
+          <w:sz w:val="27"/>
+          <w:szCs w:val="27"/>
+        </w:rPr>
+        <w:t xml:space="preserve"> fade the audio back up</w:t>
+      </w:r>
+      <w:r>
+        <w:rPr>
+          <w:rFonts w:ascii="Times New Roman" w:hAnsi="Times New Roman" w:cs="Times New Roman"/>
+          <w:color w:val="323130"/>
+          <w:sz w:val="27"/>
+          <w:szCs w:val="27"/>
+        </w:rPr>
+        <w:t xml:space="preserve"> according to the parameters set.</w:t>
+      </w:r>
     </w:p>
     <w:p>
       <w:pPr>
@@ -3924,27 +4137,16 @@
           <w:sz w:val="27"/>
           <w:szCs w:val="27"/>
         </w:rPr>
-        <w:t xml:space="preserve"> is sequential, random if the </w:t>
-      </w:r>
-      <w:proofErr w:type="spellStart"/>
-      <w:r>
-        <w:rPr>
-          <w:rFonts w:ascii="Times New Roman" w:hAnsi="Times New Roman" w:cs="Times New Roman"/>
-          <w:color w:val="323130"/>
-          <w:sz w:val="27"/>
-          <w:szCs w:val="27"/>
-        </w:rPr>
-        <w:t>spriteList</w:t>
-      </w:r>
-      <w:proofErr w:type="spellEnd"/>
-      <w:r>
-        <w:rPr>
-          <w:rFonts w:ascii="Times New Roman" w:hAnsi="Times New Roman" w:cs="Times New Roman"/>
-          <w:color w:val="323130"/>
-          <w:sz w:val="27"/>
-          <w:szCs w:val="27"/>
-        </w:rPr>
-        <w:t xml:space="preserve"> is random.</w:t>
+        <w:t xml:space="preserve"> is sequential</w:t>
+      </w:r>
+      <w:r>
+        <w:rPr>
+          <w:rFonts w:ascii="Times New Roman" w:hAnsi="Times New Roman" w:cs="Times New Roman"/>
+          <w:color w:val="323130"/>
+          <w:sz w:val="27"/>
+          <w:szCs w:val="27"/>
+        </w:rPr>
+        <w:t>.</w:t>
       </w:r>
     </w:p>
     <w:p>
@@ -4031,26 +4233,6 @@
           <w:sz w:val="27"/>
           <w:szCs w:val="27"/>
         </w:rPr>
-        <w:t>soundSprite</w:t>
-      </w:r>
-      <w:proofErr w:type="spellEnd"/>
-      <w:r>
-        <w:rPr>
-          <w:rFonts w:ascii="Times New Roman" w:hAnsi="Times New Roman" w:cs="Times New Roman"/>
-          <w:color w:val="323130"/>
-          <w:sz w:val="27"/>
-          <w:szCs w:val="27"/>
-        </w:rPr>
-        <w:t xml:space="preserve"> or </w:t>
-      </w:r>
-      <w:proofErr w:type="spellStart"/>
-      <w:r>
-        <w:rPr>
-          <w:rFonts w:ascii="Times New Roman" w:hAnsi="Times New Roman" w:cs="Times New Roman"/>
-          <w:color w:val="323130"/>
-          <w:sz w:val="27"/>
-          <w:szCs w:val="27"/>
-        </w:rPr>
         <w:t>spriteList</w:t>
       </w:r>
       <w:proofErr w:type="spellEnd"/>
@@ -4176,499 +4358,92 @@
           <w:sz w:val="27"/>
           <w:szCs w:val="27"/>
         </w:rPr>
-        <w:t>Example:</w:t>
-      </w:r>
-    </w:p>
-    <w:p>
-      <w:pPr>
-        <w:spacing w:after="240"/>
-        <w:ind w:left="600"/>
-        <w:rPr>
-          <w:rFonts w:ascii="Times New Roman" w:hAnsi="Times New Roman" w:cs="Times New Roman"/>
-          <w:color w:val="323130"/>
-          <w:sz w:val="27"/>
-          <w:szCs w:val="27"/>
-        </w:rPr>
-      </w:pPr>
-    </w:p>
-    <w:p>
-      <w:pPr>
-        <w:spacing w:after="240"/>
-        <w:ind w:left="600"/>
-        <w:rPr>
-          <w:rFonts w:ascii="Times New Roman" w:hAnsi="Times New Roman" w:cs="Times New Roman"/>
-          <w:color w:val="323130"/>
-          <w:sz w:val="27"/>
-          <w:szCs w:val="27"/>
-        </w:rPr>
-      </w:pPr>
-      <w:r>
-        <w:rPr>
-          <w:rFonts w:ascii="Times New Roman" w:hAnsi="Times New Roman" w:cs="Times New Roman"/>
-          <w:color w:val="323130"/>
-          <w:sz w:val="27"/>
-          <w:szCs w:val="27"/>
-        </w:rPr>
-        <w:t>"</w:t>
-      </w:r>
-      <w:proofErr w:type="spellStart"/>
-      <w:r>
-        <w:rPr>
-          <w:rFonts w:ascii="Times New Roman" w:hAnsi="Times New Roman" w:cs="Times New Roman"/>
-          <w:color w:val="323130"/>
-          <w:sz w:val="27"/>
-          <w:szCs w:val="27"/>
-        </w:rPr>
-        <w:t>testResetSpriteList</w:t>
-      </w:r>
-      <w:proofErr w:type="spellEnd"/>
-      <w:r>
-        <w:rPr>
-          <w:rFonts w:ascii="Times New Roman" w:hAnsi="Times New Roman" w:cs="Times New Roman"/>
-          <w:color w:val="323130"/>
-          <w:sz w:val="27"/>
-          <w:szCs w:val="27"/>
-        </w:rPr>
-        <w:t>": [</w:t>
-      </w:r>
-    </w:p>
-    <w:p>
-      <w:pPr>
-        <w:spacing w:after="240"/>
-        <w:ind w:left="1200"/>
-        <w:rPr>
-          <w:rFonts w:ascii="Times New Roman" w:hAnsi="Times New Roman" w:cs="Times New Roman"/>
-          <w:color w:val="323130"/>
-          <w:sz w:val="27"/>
-          <w:szCs w:val="27"/>
-        </w:rPr>
-      </w:pPr>
-      <w:r>
-        <w:rPr>
-          <w:rFonts w:ascii="Times New Roman" w:hAnsi="Times New Roman" w:cs="Times New Roman"/>
-          <w:color w:val="323130"/>
-          <w:sz w:val="27"/>
-          <w:szCs w:val="27"/>
-        </w:rPr>
-        <w:lastRenderedPageBreak/>
-        <w:t>{</w:t>
-      </w:r>
-    </w:p>
-    <w:p>
-      <w:pPr>
-        <w:spacing w:after="240"/>
-        <w:ind w:left="1200"/>
-        <w:rPr>
-          <w:rFonts w:ascii="Times New Roman" w:hAnsi="Times New Roman" w:cs="Times New Roman"/>
-          <w:color w:val="323130"/>
-          <w:sz w:val="27"/>
-          <w:szCs w:val="27"/>
-        </w:rPr>
-      </w:pPr>
-      <w:r>
-        <w:rPr>
-          <w:rFonts w:ascii="Times New Roman" w:hAnsi="Times New Roman" w:cs="Times New Roman"/>
-          <w:color w:val="323130"/>
-          <w:sz w:val="27"/>
-          <w:szCs w:val="27"/>
-        </w:rPr>
-        <w:t>"command": "</w:t>
-      </w:r>
-      <w:proofErr w:type="spellStart"/>
-      <w:r>
-        <w:rPr>
-          <w:rFonts w:ascii="Times New Roman" w:hAnsi="Times New Roman" w:cs="Times New Roman"/>
-          <w:color w:val="323130"/>
-          <w:sz w:val="27"/>
-          <w:szCs w:val="27"/>
-        </w:rPr>
-        <w:t>ResetSpriteList</w:t>
-      </w:r>
-      <w:proofErr w:type="spellEnd"/>
-      <w:r>
-        <w:rPr>
-          <w:rFonts w:ascii="Times New Roman" w:hAnsi="Times New Roman" w:cs="Times New Roman"/>
-          <w:color w:val="323130"/>
-          <w:sz w:val="27"/>
-          <w:szCs w:val="27"/>
-        </w:rPr>
-        <w:t>",</w:t>
-      </w:r>
-    </w:p>
-    <w:p>
-      <w:pPr>
-        <w:spacing w:after="240"/>
-        <w:ind w:left="1200"/>
-        <w:rPr>
-          <w:rFonts w:ascii="Times New Roman" w:hAnsi="Times New Roman" w:cs="Times New Roman"/>
-          <w:color w:val="323130"/>
-          <w:sz w:val="27"/>
-          <w:szCs w:val="27"/>
-        </w:rPr>
-      </w:pPr>
-      <w:r>
-        <w:rPr>
-          <w:rFonts w:ascii="Times New Roman" w:hAnsi="Times New Roman" w:cs="Times New Roman"/>
-          <w:color w:val="323130"/>
-          <w:sz w:val="27"/>
-          <w:szCs w:val="27"/>
-        </w:rPr>
-        <w:t>"</w:t>
-      </w:r>
-      <w:proofErr w:type="spellStart"/>
-      <w:r>
-        <w:rPr>
-          <w:rFonts w:ascii="Times New Roman" w:hAnsi="Times New Roman" w:cs="Times New Roman"/>
-          <w:color w:val="323130"/>
-          <w:sz w:val="27"/>
-          <w:szCs w:val="27"/>
-        </w:rPr>
-        <w:t>spriteListId</w:t>
-      </w:r>
-      <w:proofErr w:type="spellEnd"/>
-      <w:r>
-        <w:rPr>
-          <w:rFonts w:ascii="Times New Roman" w:hAnsi="Times New Roman" w:cs="Times New Roman"/>
-          <w:color w:val="323130"/>
-          <w:sz w:val="27"/>
-          <w:szCs w:val="27"/>
-        </w:rPr>
-        <w:t>": "</w:t>
-      </w:r>
-      <w:proofErr w:type="spellStart"/>
-      <w:r>
-        <w:rPr>
-          <w:rFonts w:ascii="Times New Roman" w:hAnsi="Times New Roman" w:cs="Times New Roman"/>
-          <w:color w:val="323130"/>
-          <w:sz w:val="27"/>
-          <w:szCs w:val="27"/>
-        </w:rPr>
-        <w:t>MarimbaNotesSequential</w:t>
-      </w:r>
-      <w:proofErr w:type="spellEnd"/>
-      <w:r>
-        <w:rPr>
-          <w:rFonts w:ascii="Times New Roman" w:hAnsi="Times New Roman" w:cs="Times New Roman"/>
-          <w:color w:val="323130"/>
-          <w:sz w:val="27"/>
-          <w:szCs w:val="27"/>
-        </w:rPr>
-        <w:t>"</w:t>
-      </w:r>
-    </w:p>
-    <w:p>
-      <w:pPr>
-        <w:spacing w:after="240"/>
-        <w:ind w:left="1200"/>
-        <w:rPr>
-          <w:rFonts w:ascii="Times New Roman" w:hAnsi="Times New Roman" w:cs="Times New Roman"/>
-          <w:color w:val="323130"/>
-          <w:sz w:val="27"/>
-          <w:szCs w:val="27"/>
-        </w:rPr>
-      </w:pPr>
-      <w:r>
-        <w:rPr>
-          <w:rFonts w:ascii="Times New Roman" w:hAnsi="Times New Roman" w:cs="Times New Roman"/>
-          <w:color w:val="323130"/>
-          <w:sz w:val="27"/>
-          <w:szCs w:val="27"/>
-        </w:rPr>
-        <w:t>},</w:t>
-      </w:r>
-    </w:p>
-    <w:p>
-      <w:pPr>
-        <w:spacing w:after="240"/>
-        <w:ind w:left="1200"/>
-        <w:rPr>
-          <w:rFonts w:ascii="Times New Roman" w:hAnsi="Times New Roman" w:cs="Times New Roman"/>
-          <w:color w:val="323130"/>
-          <w:sz w:val="27"/>
-          <w:szCs w:val="27"/>
-        </w:rPr>
-      </w:pPr>
-      <w:r>
-        <w:rPr>
-          <w:rFonts w:ascii="Times New Roman" w:hAnsi="Times New Roman" w:cs="Times New Roman"/>
-          <w:color w:val="323130"/>
-          <w:sz w:val="27"/>
-          <w:szCs w:val="27"/>
-        </w:rPr>
-        <w:t>{</w:t>
-      </w:r>
-    </w:p>
-    <w:p>
-      <w:pPr>
-        <w:spacing w:after="240"/>
-        <w:ind w:left="1200"/>
-        <w:rPr>
-          <w:rFonts w:ascii="Times New Roman" w:hAnsi="Times New Roman" w:cs="Times New Roman"/>
-          <w:color w:val="323130"/>
-          <w:sz w:val="27"/>
-          <w:szCs w:val="27"/>
-        </w:rPr>
-      </w:pPr>
-      <w:r>
-        <w:rPr>
-          <w:rFonts w:ascii="Times New Roman" w:hAnsi="Times New Roman" w:cs="Times New Roman"/>
-          <w:color w:val="323130"/>
-          <w:sz w:val="27"/>
-          <w:szCs w:val="27"/>
-        </w:rPr>
-        <w:t>"command": "</w:t>
-      </w:r>
-      <w:proofErr w:type="spellStart"/>
-      <w:r>
-        <w:rPr>
-          <w:rFonts w:ascii="Times New Roman" w:hAnsi="Times New Roman" w:cs="Times New Roman"/>
-          <w:color w:val="323130"/>
-          <w:sz w:val="27"/>
-          <w:szCs w:val="27"/>
-        </w:rPr>
-        <w:t>ResetSpriteList</w:t>
-      </w:r>
-      <w:proofErr w:type="spellEnd"/>
-      <w:r>
-        <w:rPr>
-          <w:rFonts w:ascii="Times New Roman" w:hAnsi="Times New Roman" w:cs="Times New Roman"/>
-          <w:color w:val="323130"/>
-          <w:sz w:val="27"/>
-          <w:szCs w:val="27"/>
-        </w:rPr>
-        <w:t>",</w:t>
-      </w:r>
-    </w:p>
-    <w:p>
-      <w:pPr>
-        <w:spacing w:after="240"/>
-        <w:ind w:left="1200"/>
-        <w:rPr>
-          <w:rFonts w:ascii="Times New Roman" w:hAnsi="Times New Roman" w:cs="Times New Roman"/>
-          <w:color w:val="323130"/>
-          <w:sz w:val="27"/>
-          <w:szCs w:val="27"/>
-        </w:rPr>
-      </w:pPr>
-      <w:r>
-        <w:rPr>
-          <w:rFonts w:ascii="Times New Roman" w:hAnsi="Times New Roman" w:cs="Times New Roman"/>
-          <w:color w:val="323130"/>
-          <w:sz w:val="27"/>
-          <w:szCs w:val="27"/>
-        </w:rPr>
-        <w:t>"</w:t>
-      </w:r>
-      <w:proofErr w:type="spellStart"/>
-      <w:r>
-        <w:rPr>
-          <w:rFonts w:ascii="Times New Roman" w:hAnsi="Times New Roman" w:cs="Times New Roman"/>
-          <w:color w:val="323130"/>
-          <w:sz w:val="27"/>
-          <w:szCs w:val="27"/>
-        </w:rPr>
-        <w:t>spriteListId</w:t>
-      </w:r>
-      <w:proofErr w:type="spellEnd"/>
-      <w:r>
-        <w:rPr>
-          <w:rFonts w:ascii="Times New Roman" w:hAnsi="Times New Roman" w:cs="Times New Roman"/>
-          <w:color w:val="323130"/>
-          <w:sz w:val="27"/>
-          <w:szCs w:val="27"/>
-        </w:rPr>
-        <w:t>": "</w:t>
-      </w:r>
-      <w:proofErr w:type="spellStart"/>
-      <w:r>
-        <w:rPr>
-          <w:rFonts w:ascii="Times New Roman" w:hAnsi="Times New Roman" w:cs="Times New Roman"/>
-          <w:color w:val="323130"/>
-          <w:sz w:val="27"/>
-          <w:szCs w:val="27"/>
-        </w:rPr>
-        <w:t>MarimbaNotesRandom</w:t>
-      </w:r>
-      <w:proofErr w:type="spellEnd"/>
-      <w:r>
-        <w:rPr>
-          <w:rFonts w:ascii="Times New Roman" w:hAnsi="Times New Roman" w:cs="Times New Roman"/>
-          <w:color w:val="323130"/>
-          <w:sz w:val="27"/>
-          <w:szCs w:val="27"/>
-        </w:rPr>
-        <w:t>"</w:t>
-      </w:r>
-    </w:p>
-    <w:p>
-      <w:pPr>
-        <w:spacing w:after="240"/>
-        <w:ind w:left="1200"/>
-        <w:rPr>
-          <w:rFonts w:ascii="Times New Roman" w:hAnsi="Times New Roman" w:cs="Times New Roman"/>
-          <w:color w:val="323130"/>
-          <w:sz w:val="27"/>
-          <w:szCs w:val="27"/>
-        </w:rPr>
-      </w:pPr>
-      <w:r>
-        <w:rPr>
-          <w:rFonts w:ascii="Times New Roman" w:hAnsi="Times New Roman" w:cs="Times New Roman"/>
-          <w:color w:val="323130"/>
-          <w:sz w:val="27"/>
-          <w:szCs w:val="27"/>
-        </w:rPr>
-        <w:t>},</w:t>
-      </w:r>
-    </w:p>
-    <w:p>
-      <w:pPr>
-        <w:spacing w:after="240"/>
-        <w:ind w:left="1200"/>
-        <w:rPr>
-          <w:rFonts w:ascii="Times New Roman" w:hAnsi="Times New Roman" w:cs="Times New Roman"/>
-          <w:color w:val="323130"/>
-          <w:sz w:val="27"/>
-          <w:szCs w:val="27"/>
-        </w:rPr>
-      </w:pPr>
-      <w:r>
-        <w:rPr>
-          <w:rFonts w:ascii="Times New Roman" w:hAnsi="Times New Roman" w:cs="Times New Roman"/>
-          <w:color w:val="323130"/>
-          <w:sz w:val="27"/>
-          <w:szCs w:val="27"/>
-        </w:rPr>
-        <w:t>{</w:t>
-      </w:r>
-    </w:p>
-    <w:p>
-      <w:pPr>
-        <w:spacing w:after="240"/>
-        <w:ind w:left="1200"/>
-        <w:rPr>
-          <w:rFonts w:ascii="Times New Roman" w:hAnsi="Times New Roman" w:cs="Times New Roman"/>
-          <w:color w:val="323130"/>
-          <w:sz w:val="27"/>
-          <w:szCs w:val="27"/>
-        </w:rPr>
-      </w:pPr>
-      <w:r>
-        <w:rPr>
-          <w:rFonts w:ascii="Times New Roman" w:hAnsi="Times New Roman" w:cs="Times New Roman"/>
-          <w:color w:val="323130"/>
-          <w:sz w:val="27"/>
-          <w:szCs w:val="27"/>
-        </w:rPr>
-        <w:t>"command": "</w:t>
-      </w:r>
-      <w:proofErr w:type="spellStart"/>
-      <w:r>
-        <w:rPr>
-          <w:rFonts w:ascii="Times New Roman" w:hAnsi="Times New Roman" w:cs="Times New Roman"/>
-          <w:color w:val="323130"/>
-          <w:sz w:val="27"/>
-          <w:szCs w:val="27"/>
-        </w:rPr>
-        <w:t>ResetSpriteList</w:t>
-      </w:r>
-      <w:proofErr w:type="spellEnd"/>
-      <w:r>
-        <w:rPr>
-          <w:rFonts w:ascii="Times New Roman" w:hAnsi="Times New Roman" w:cs="Times New Roman"/>
-          <w:color w:val="323130"/>
-          <w:sz w:val="27"/>
-          <w:szCs w:val="27"/>
-        </w:rPr>
-        <w:t>",</w:t>
-      </w:r>
-    </w:p>
-    <w:p>
-      <w:pPr>
-        <w:spacing w:after="240"/>
-        <w:ind w:left="1200"/>
-        <w:rPr>
-          <w:rFonts w:ascii="Times New Roman" w:hAnsi="Times New Roman" w:cs="Times New Roman"/>
-          <w:color w:val="323130"/>
-          <w:sz w:val="27"/>
-          <w:szCs w:val="27"/>
-        </w:rPr>
-      </w:pPr>
-      <w:r>
-        <w:rPr>
-          <w:rFonts w:ascii="Times New Roman" w:hAnsi="Times New Roman" w:cs="Times New Roman"/>
-          <w:color w:val="323130"/>
-          <w:sz w:val="27"/>
-          <w:szCs w:val="27"/>
-        </w:rPr>
-        <w:t>"</w:t>
-      </w:r>
-      <w:proofErr w:type="spellStart"/>
-      <w:r>
-        <w:rPr>
-          <w:rFonts w:ascii="Times New Roman" w:hAnsi="Times New Roman" w:cs="Times New Roman"/>
-          <w:color w:val="323130"/>
-          <w:sz w:val="27"/>
-          <w:szCs w:val="27"/>
-        </w:rPr>
-        <w:t>spriteListId</w:t>
-      </w:r>
-      <w:proofErr w:type="spellEnd"/>
-      <w:r>
-        <w:rPr>
-          <w:rFonts w:ascii="Times New Roman" w:hAnsi="Times New Roman" w:cs="Times New Roman"/>
-          <w:color w:val="323130"/>
-          <w:sz w:val="27"/>
-          <w:szCs w:val="27"/>
-        </w:rPr>
-        <w:t>": "</w:t>
-      </w:r>
-      <w:proofErr w:type="spellStart"/>
-      <w:r>
-        <w:rPr>
-          <w:rFonts w:ascii="Times New Roman" w:hAnsi="Times New Roman" w:cs="Times New Roman"/>
-          <w:color w:val="323130"/>
-          <w:sz w:val="27"/>
-          <w:szCs w:val="27"/>
-        </w:rPr>
-        <w:t>MarimbaNotesDifferentSequence</w:t>
-      </w:r>
-      <w:proofErr w:type="spellEnd"/>
-      <w:r>
-        <w:rPr>
-          <w:rFonts w:ascii="Times New Roman" w:hAnsi="Times New Roman" w:cs="Times New Roman"/>
-          <w:color w:val="323130"/>
-          <w:sz w:val="27"/>
-          <w:szCs w:val="27"/>
-        </w:rPr>
-        <w:t>"</w:t>
-      </w:r>
-    </w:p>
-    <w:p>
-      <w:pPr>
-        <w:spacing w:after="240"/>
-        <w:ind w:left="1200"/>
-        <w:rPr>
-          <w:rFonts w:ascii="Times New Roman" w:hAnsi="Times New Roman" w:cs="Times New Roman"/>
-          <w:color w:val="323130"/>
-          <w:sz w:val="27"/>
-          <w:szCs w:val="27"/>
-        </w:rPr>
-      </w:pPr>
-      <w:r>
-        <w:rPr>
-          <w:rFonts w:ascii="Times New Roman" w:hAnsi="Times New Roman" w:cs="Times New Roman"/>
-          <w:color w:val="323130"/>
-          <w:sz w:val="27"/>
-          <w:szCs w:val="27"/>
-        </w:rPr>
-        <w:t>}</w:t>
-      </w:r>
-    </w:p>
-    <w:p>
-      <w:pPr>
-        <w:spacing w:after="240"/>
-        <w:ind w:left="600"/>
+        <w:t>Example</w:t>
+      </w:r>
+      <w:r>
+        <w:rPr>
+          <w:rFonts w:ascii="Times New Roman" w:hAnsi="Times New Roman" w:cs="Times New Roman"/>
+          <w:color w:val="323130"/>
+          <w:sz w:val="27"/>
+          <w:szCs w:val="27"/>
+        </w:rPr>
+        <w:t xml:space="preserve"> will reset smart sounds to first smart sound after 3 seconds.</w:t>
+      </w:r>
+    </w:p>
+    <w:p>
+      <w:pPr>
+        <w:spacing w:after="240"/>
+        <w:rPr>
+          <w:rFonts w:ascii="Times New Roman" w:hAnsi="Times New Roman" w:cs="Times New Roman"/>
+          <w:color w:val="323130"/>
+          <w:sz w:val="27"/>
+          <w:szCs w:val="27"/>
+        </w:rPr>
+      </w:pPr>
+      <w:r>
+        <w:rPr>
+          <w:rFonts w:ascii="Times New Roman" w:hAnsi="Times New Roman" w:cs="Times New Roman"/>
+          <w:color w:val="323130"/>
+          <w:sz w:val="27"/>
+          <w:szCs w:val="27"/>
+        </w:rPr>
+        <w:t>"onBonusSymbolLand</w:t>
+      </w:r>
+      <w:proofErr w:type="gramStart"/>
+      <w:r>
+        <w:rPr>
+          <w:rFonts w:ascii="Times New Roman" w:hAnsi="Times New Roman" w:cs="Times New Roman"/>
+          <w:color w:val="323130"/>
+          <w:sz w:val="27"/>
+          <w:szCs w:val="27"/>
+        </w:rPr>
+        <w:t>":[</w:t>
+      </w:r>
+      <w:proofErr w:type="gramEnd"/>
+    </w:p>
+    <w:p>
+      <w:pPr>
+        <w:spacing w:after="240"/>
+        <w:rPr>
+          <w:rFonts w:ascii="Times New Roman" w:hAnsi="Times New Roman" w:cs="Times New Roman"/>
+          <w:color w:val="323130"/>
+          <w:sz w:val="25"/>
+          <w:szCs w:val="25"/>
+        </w:rPr>
+      </w:pPr>
+      <w:r>
+        <w:rPr>
+          <w:rFonts w:ascii="Times New Roman" w:hAnsi="Times New Roman" w:cs="Times New Roman"/>
+          <w:color w:val="323130"/>
+          <w:sz w:val="25"/>
+          <w:szCs w:val="25"/>
+        </w:rPr>
+        <w:t>{"command":"Play","spriteListId":"sl_SymbolB01Land"},</w:t>
+      </w:r>
+    </w:p>
+    <w:p>
+      <w:pPr>
+        <w:spacing w:after="240"/>
+        <w:rPr>
+          <w:rFonts w:ascii="Times New Roman" w:hAnsi="Times New Roman" w:cs="Times New Roman"/>
+          <w:color w:val="323130"/>
+          <w:sz w:val="25"/>
+          <w:szCs w:val="25"/>
+        </w:rPr>
+      </w:pPr>
+      <w:r>
+        <w:rPr>
+          <w:rFonts w:ascii="Times New Roman" w:hAnsi="Times New Roman" w:cs="Times New Roman"/>
+          <w:color w:val="323130"/>
+          <w:sz w:val="25"/>
+          <w:szCs w:val="25"/>
+        </w:rPr>
+        <w:t>{"command":"ResetSpriteList","spriteListId":"sl_SymbolB01Land","delay":3000}</w:t>
+      </w:r>
+    </w:p>
+    <w:p>
+      <w:pPr>
+        <w:spacing w:after="240"/>
         <w:rPr>
           <w:rFonts w:ascii="Times New Roman" w:hAnsi="Times New Roman" w:cs="Times New Roman"/>
           <w:color w:val="323130"/>
@@ -4685,17 +4460,6 @@
         </w:rPr>
         <w:t>],</w:t>
       </w:r>
-    </w:p>
-    <w:p>
-      <w:pPr>
-        <w:spacing w:after="240"/>
-        <w:rPr>
-          <w:rFonts w:ascii="Times New Roman" w:hAnsi="Times New Roman" w:cs="Times New Roman"/>
-          <w:color w:val="323130"/>
-          <w:sz w:val="27"/>
-          <w:szCs w:val="27"/>
-        </w:rPr>
-      </w:pPr>
     </w:p>
     <w:p>
       <w:pPr>
@@ -4900,7 +4664,6 @@
           <w:sz w:val="27"/>
           <w:szCs w:val="27"/>
         </w:rPr>
-        <w:lastRenderedPageBreak/>
         <w:t xml:space="preserve">This example shows a sequences </w:t>
       </w:r>
       <w:proofErr w:type="spellStart"/>
@@ -4938,6 +4701,210 @@
     <w:p>
       <w:pPr>
         <w:spacing w:after="240"/>
+        <w:rPr>
+          <w:rFonts w:ascii="Times New Roman" w:hAnsi="Times New Roman" w:cs="Times New Roman"/>
+          <w:color w:val="323130"/>
+          <w:sz w:val="27"/>
+          <w:szCs w:val="27"/>
+        </w:rPr>
+      </w:pPr>
+      <w:r>
+        <w:rPr>
+          <w:rFonts w:ascii="Times New Roman" w:hAnsi="Times New Roman" w:cs="Times New Roman"/>
+          <w:color w:val="323130"/>
+          <w:sz w:val="27"/>
+          <w:szCs w:val="27"/>
+        </w:rPr>
+        <w:t>"</w:t>
+      </w:r>
+      <w:proofErr w:type="spellStart"/>
+      <w:r>
+        <w:rPr>
+          <w:rFonts w:ascii="Times New Roman" w:hAnsi="Times New Roman" w:cs="Times New Roman"/>
+          <w:color w:val="323130"/>
+          <w:sz w:val="27"/>
+          <w:szCs w:val="27"/>
+        </w:rPr>
+        <w:t>onBonusSymbolLand</w:t>
+      </w:r>
+      <w:proofErr w:type="spellEnd"/>
+      <w:r>
+        <w:rPr>
+          <w:rFonts w:ascii="Times New Roman" w:hAnsi="Times New Roman" w:cs="Times New Roman"/>
+          <w:color w:val="323130"/>
+          <w:sz w:val="27"/>
+          <w:szCs w:val="27"/>
+        </w:rPr>
+        <w:t>":</w:t>
+      </w:r>
+    </w:p>
+    <w:p>
+      <w:pPr>
+        <w:spacing w:after="240"/>
+        <w:ind w:firstLine="720"/>
+        <w:rPr>
+          <w:rFonts w:ascii="Times New Roman" w:hAnsi="Times New Roman" w:cs="Times New Roman"/>
+          <w:color w:val="323130"/>
+          <w:sz w:val="27"/>
+          <w:szCs w:val="27"/>
+        </w:rPr>
+      </w:pPr>
+      <w:r>
+        <w:rPr>
+          <w:rFonts w:ascii="Times New Roman" w:hAnsi="Times New Roman" w:cs="Times New Roman"/>
+          <w:color w:val="323130"/>
+          <w:sz w:val="27"/>
+          <w:szCs w:val="27"/>
+        </w:rPr>
+        <w:t xml:space="preserve"> [</w:t>
+      </w:r>
+    </w:p>
+    <w:p>
+      <w:pPr>
+        <w:spacing w:after="240"/>
+        <w:ind w:firstLine="720"/>
+        <w:rPr>
+          <w:rFonts w:ascii="Times New Roman" w:hAnsi="Times New Roman" w:cs="Times New Roman"/>
+          <w:color w:val="323130"/>
+          <w:sz w:val="27"/>
+          <w:szCs w:val="27"/>
+        </w:rPr>
+      </w:pPr>
+      <w:r>
+        <w:rPr>
+          <w:rFonts w:ascii="Times New Roman" w:hAnsi="Times New Roman" w:cs="Times New Roman"/>
+          <w:color w:val="323130"/>
+          <w:sz w:val="27"/>
+          <w:szCs w:val="27"/>
+        </w:rPr>
+        <w:t>{"command": "Play","</w:t>
+      </w:r>
+      <w:proofErr w:type="spellStart"/>
+      <w:r>
+        <w:rPr>
+          <w:rFonts w:ascii="Times New Roman" w:hAnsi="Times New Roman" w:cs="Times New Roman"/>
+          <w:color w:val="323130"/>
+          <w:sz w:val="27"/>
+          <w:szCs w:val="27"/>
+        </w:rPr>
+        <w:t>spriteListId</w:t>
+      </w:r>
+      <w:proofErr w:type="spellEnd"/>
+      <w:r>
+        <w:rPr>
+          <w:rFonts w:ascii="Times New Roman" w:hAnsi="Times New Roman" w:cs="Times New Roman"/>
+          <w:color w:val="323130"/>
+          <w:sz w:val="27"/>
+          <w:szCs w:val="27"/>
+        </w:rPr>
+        <w:t>": "</w:t>
+      </w:r>
+      <w:proofErr w:type="spellStart"/>
+      <w:r>
+        <w:rPr>
+          <w:rFonts w:ascii="Times New Roman" w:hAnsi="Times New Roman" w:cs="Times New Roman"/>
+          <w:color w:val="323130"/>
+          <w:sz w:val="27"/>
+          <w:szCs w:val="27"/>
+        </w:rPr>
+        <w:t>bonusSymbolLandSet</w:t>
+      </w:r>
+      <w:proofErr w:type="spellEnd"/>
+      <w:r>
+        <w:rPr>
+          <w:rFonts w:ascii="Times New Roman" w:hAnsi="Times New Roman" w:cs="Times New Roman"/>
+          <w:color w:val="323130"/>
+          <w:sz w:val="27"/>
+          <w:szCs w:val="27"/>
+        </w:rPr>
+        <w:t>"},</w:t>
+      </w:r>
+    </w:p>
+    <w:p>
+      <w:pPr>
+        <w:spacing w:after="240"/>
+        <w:ind w:firstLine="720"/>
+        <w:rPr>
+          <w:rFonts w:ascii="Times New Roman" w:hAnsi="Times New Roman" w:cs="Times New Roman"/>
+          <w:color w:val="323130"/>
+          <w:sz w:val="27"/>
+          <w:szCs w:val="27"/>
+        </w:rPr>
+      </w:pPr>
+      <w:r>
+        <w:rPr>
+          <w:rFonts w:ascii="Times New Roman" w:hAnsi="Times New Roman" w:cs="Times New Roman"/>
+          <w:color w:val="323130"/>
+          <w:sz w:val="27"/>
+          <w:szCs w:val="27"/>
+        </w:rPr>
+        <w:t>{"command": "Execute","</w:t>
+      </w:r>
+      <w:proofErr w:type="spellStart"/>
+      <w:r>
+        <w:rPr>
+          <w:rFonts w:ascii="Times New Roman" w:hAnsi="Times New Roman" w:cs="Times New Roman"/>
+          <w:color w:val="323130"/>
+          <w:sz w:val="27"/>
+          <w:szCs w:val="27"/>
+        </w:rPr>
+        <w:t>commandId</w:t>
+      </w:r>
+      <w:proofErr w:type="spellEnd"/>
+      <w:r>
+        <w:rPr>
+          <w:rFonts w:ascii="Times New Roman" w:hAnsi="Times New Roman" w:cs="Times New Roman"/>
+          <w:color w:val="323130"/>
+          <w:sz w:val="27"/>
+          <w:szCs w:val="27"/>
+        </w:rPr>
+        <w:t>": "</w:t>
+      </w:r>
+      <w:proofErr w:type="spellStart"/>
+      <w:r>
+        <w:rPr>
+          <w:rFonts w:ascii="Times New Roman" w:hAnsi="Times New Roman" w:cs="Times New Roman"/>
+          <w:color w:val="323130"/>
+          <w:sz w:val="27"/>
+          <w:szCs w:val="27"/>
+        </w:rPr>
+        <w:t>resetAnticipationSpritelists</w:t>
+      </w:r>
+      <w:proofErr w:type="spellEnd"/>
+      <w:r>
+        <w:rPr>
+          <w:rFonts w:ascii="Times New Roman" w:hAnsi="Times New Roman" w:cs="Times New Roman"/>
+          <w:color w:val="323130"/>
+          <w:sz w:val="27"/>
+          <w:szCs w:val="27"/>
+        </w:rPr>
+        <w:t>"}</w:t>
+      </w:r>
+    </w:p>
+    <w:p>
+      <w:pPr>
+        <w:spacing w:after="240"/>
+        <w:ind w:firstLine="720"/>
+        <w:rPr>
+          <w:rFonts w:ascii="Times New Roman" w:hAnsi="Times New Roman" w:cs="Times New Roman"/>
+          <w:color w:val="323130"/>
+          <w:sz w:val="27"/>
+          <w:szCs w:val="27"/>
+        </w:rPr>
+      </w:pPr>
+      <w:r>
+        <w:rPr>
+          <w:rFonts w:ascii="Times New Roman" w:hAnsi="Times New Roman" w:cs="Times New Roman"/>
+          <w:color w:val="323130"/>
+          <w:sz w:val="27"/>
+          <w:szCs w:val="27"/>
+        </w:rPr>
+        <w:t>],</w:t>
+      </w:r>
+    </w:p>
+    <w:p>
+      <w:pPr>
+        <w:spacing w:after="240"/>
         <w:ind w:left="600"/>
         <w:rPr>
           <w:rFonts w:ascii="Times New Roman" w:hAnsi="Times New Roman" w:cs="Times New Roman"/>
@@ -4946,6 +4913,89 @@
           <w:szCs w:val="27"/>
         </w:rPr>
       </w:pPr>
+    </w:p>
+    <w:p>
+      <w:pPr>
+        <w:spacing w:after="240"/>
+        <w:rPr>
+          <w:rFonts w:ascii="Times New Roman" w:hAnsi="Times New Roman" w:cs="Times New Roman"/>
+          <w:color w:val="323130"/>
+          <w:sz w:val="27"/>
+          <w:szCs w:val="27"/>
+        </w:rPr>
+      </w:pPr>
+      <w:r>
+        <w:rPr>
+          <w:rFonts w:ascii="Times New Roman" w:hAnsi="Times New Roman" w:cs="Times New Roman"/>
+          <w:color w:val="323130"/>
+          <w:sz w:val="27"/>
+          <w:szCs w:val="27"/>
+        </w:rPr>
+        <w:t>This is the '</w:t>
+      </w:r>
+      <w:proofErr w:type="spellStart"/>
+      <w:r>
+        <w:rPr>
+          <w:rFonts w:ascii="Times New Roman" w:hAnsi="Times New Roman" w:cs="Times New Roman"/>
+          <w:color w:val="323130"/>
+          <w:sz w:val="27"/>
+          <w:szCs w:val="27"/>
+        </w:rPr>
+        <w:t>resetAnticipationSpritelists</w:t>
+      </w:r>
+      <w:proofErr w:type="spellEnd"/>
+      <w:r>
+        <w:rPr>
+          <w:rFonts w:ascii="Times New Roman" w:hAnsi="Times New Roman" w:cs="Times New Roman"/>
+          <w:color w:val="323130"/>
+          <w:sz w:val="27"/>
+          <w:szCs w:val="27"/>
+        </w:rPr>
+        <w:t>' command being executed in '</w:t>
+      </w:r>
+      <w:proofErr w:type="spellStart"/>
+      <w:r>
+        <w:rPr>
+          <w:rFonts w:ascii="Times New Roman" w:hAnsi="Times New Roman" w:cs="Times New Roman"/>
+          <w:color w:val="323130"/>
+          <w:sz w:val="27"/>
+          <w:szCs w:val="27"/>
+        </w:rPr>
+        <w:t>onBonusSymbolLand</w:t>
+      </w:r>
+      <w:proofErr w:type="spellEnd"/>
+      <w:r>
+        <w:rPr>
+          <w:rFonts w:ascii="Times New Roman" w:hAnsi="Times New Roman" w:cs="Times New Roman"/>
+          <w:color w:val="323130"/>
+          <w:sz w:val="27"/>
+          <w:szCs w:val="27"/>
+        </w:rPr>
+        <w:t>':</w:t>
+      </w:r>
+    </w:p>
+    <w:p>
+      <w:pPr>
+        <w:spacing w:after="240"/>
+        <w:ind w:left="600"/>
+        <w:rPr>
+          <w:rFonts w:ascii="Times New Roman" w:hAnsi="Times New Roman" w:cs="Times New Roman"/>
+          <w:color w:val="323130"/>
+          <w:sz w:val="27"/>
+          <w:szCs w:val="27"/>
+        </w:rPr>
+      </w:pPr>
+    </w:p>
+    <w:p>
+      <w:pPr>
+        <w:spacing w:after="240"/>
+        <w:rPr>
+          <w:rFonts w:ascii="Times New Roman" w:hAnsi="Times New Roman" w:cs="Times New Roman"/>
+          <w:color w:val="323130"/>
+          <w:sz w:val="27"/>
+          <w:szCs w:val="27"/>
+        </w:rPr>
+      </w:pPr>
       <w:r>
         <w:rPr>
           <w:rFonts w:ascii="Times New Roman" w:hAnsi="Times New Roman" w:cs="Times New Roman"/>
@@ -4963,88 +5013,87 @@
           <w:sz w:val="27"/>
           <w:szCs w:val="27"/>
         </w:rPr>
-        <w:t>onBonusSymbolLand</w:t>
-      </w:r>
-      <w:proofErr w:type="spellEnd"/>
-      <w:r>
-        <w:rPr>
-          <w:rFonts w:ascii="Times New Roman" w:hAnsi="Times New Roman" w:cs="Times New Roman"/>
-          <w:color w:val="323130"/>
-          <w:sz w:val="27"/>
-          <w:szCs w:val="27"/>
-        </w:rPr>
-        <w:t>": [</w:t>
-      </w:r>
-    </w:p>
-    <w:p>
-      <w:pPr>
-        <w:spacing w:after="240"/>
-        <w:ind w:left="1200"/>
-        <w:rPr>
-          <w:rFonts w:ascii="Times New Roman" w:hAnsi="Times New Roman" w:cs="Times New Roman"/>
-          <w:color w:val="323130"/>
-          <w:sz w:val="27"/>
-          <w:szCs w:val="27"/>
-        </w:rPr>
-      </w:pPr>
-      <w:r>
-        <w:rPr>
-          <w:rFonts w:ascii="Times New Roman" w:hAnsi="Times New Roman" w:cs="Times New Roman"/>
-          <w:color w:val="323130"/>
-          <w:sz w:val="27"/>
-          <w:szCs w:val="27"/>
-        </w:rPr>
-        <w:t>{</w:t>
-      </w:r>
-    </w:p>
-    <w:p>
-      <w:pPr>
-        <w:spacing w:after="240"/>
-        <w:ind w:left="1200"/>
-        <w:rPr>
-          <w:rFonts w:ascii="Times New Roman" w:hAnsi="Times New Roman" w:cs="Times New Roman"/>
-          <w:color w:val="323130"/>
-          <w:sz w:val="27"/>
-          <w:szCs w:val="27"/>
-        </w:rPr>
-      </w:pPr>
-      <w:r>
-        <w:rPr>
-          <w:rFonts w:ascii="Times New Roman" w:hAnsi="Times New Roman" w:cs="Times New Roman"/>
-          <w:color w:val="323130"/>
-          <w:sz w:val="27"/>
-          <w:szCs w:val="27"/>
-        </w:rPr>
-        <w:t>"command": "Play",</w:t>
-      </w:r>
-    </w:p>
-    <w:p>
-      <w:pPr>
-        <w:spacing w:after="240"/>
-        <w:ind w:left="1200"/>
-        <w:rPr>
-          <w:rFonts w:ascii="Times New Roman" w:hAnsi="Times New Roman" w:cs="Times New Roman"/>
-          <w:color w:val="323130"/>
-          <w:sz w:val="27"/>
-          <w:szCs w:val="27"/>
-        </w:rPr>
-      </w:pPr>
-      <w:r>
-        <w:rPr>
-          <w:rFonts w:ascii="Times New Roman" w:hAnsi="Times New Roman" w:cs="Times New Roman"/>
-          <w:color w:val="323130"/>
-          <w:sz w:val="27"/>
-          <w:szCs w:val="27"/>
-        </w:rPr>
-        <w:t>"</w:t>
-      </w:r>
-      <w:proofErr w:type="spellStart"/>
-      <w:r>
-        <w:rPr>
-          <w:rFonts w:ascii="Times New Roman" w:hAnsi="Times New Roman" w:cs="Times New Roman"/>
-          <w:color w:val="323130"/>
-          <w:sz w:val="27"/>
-          <w:szCs w:val="27"/>
+        <w:t>resetAnticipationSpritelists</w:t>
+      </w:r>
+      <w:proofErr w:type="spellEnd"/>
+      <w:r>
+        <w:rPr>
+          <w:rFonts w:ascii="Times New Roman" w:hAnsi="Times New Roman" w:cs="Times New Roman"/>
+          <w:color w:val="323130"/>
+          <w:sz w:val="27"/>
+          <w:szCs w:val="27"/>
+        </w:rPr>
+        <w:t xml:space="preserve">": </w:t>
+      </w:r>
+    </w:p>
+    <w:p>
+      <w:pPr>
+        <w:spacing w:after="240"/>
+        <w:ind w:firstLine="720"/>
+        <w:rPr>
+          <w:rFonts w:ascii="Times New Roman" w:hAnsi="Times New Roman" w:cs="Times New Roman"/>
+          <w:color w:val="323130"/>
+          <w:sz w:val="25"/>
+          <w:szCs w:val="25"/>
+        </w:rPr>
+      </w:pPr>
+      <w:r>
+        <w:rPr>
+          <w:rFonts w:ascii="Times New Roman" w:hAnsi="Times New Roman" w:cs="Times New Roman"/>
+          <w:color w:val="323130"/>
+          <w:sz w:val="25"/>
+          <w:szCs w:val="25"/>
+        </w:rPr>
+        <w:t>[</w:t>
+      </w:r>
+    </w:p>
+    <w:p>
+      <w:pPr>
+        <w:spacing w:after="240"/>
+        <w:ind w:firstLine="720"/>
+        <w:rPr>
+          <w:rFonts w:ascii="Times New Roman" w:hAnsi="Times New Roman" w:cs="Times New Roman"/>
+          <w:color w:val="323130"/>
+          <w:sz w:val="25"/>
+          <w:szCs w:val="25"/>
+        </w:rPr>
+      </w:pPr>
+      <w:r>
+        <w:rPr>
+          <w:rFonts w:ascii="Times New Roman" w:hAnsi="Times New Roman" w:cs="Times New Roman"/>
+          <w:color w:val="323130"/>
+          <w:sz w:val="25"/>
+          <w:szCs w:val="25"/>
+        </w:rPr>
+        <w:t>{"command": "</w:t>
+      </w:r>
+      <w:proofErr w:type="spellStart"/>
+      <w:r>
+        <w:rPr>
+          <w:rFonts w:ascii="Times New Roman" w:hAnsi="Times New Roman" w:cs="Times New Roman"/>
+          <w:color w:val="323130"/>
+          <w:sz w:val="25"/>
+          <w:szCs w:val="25"/>
+        </w:rPr>
+        <w:t>ResetSpriteList</w:t>
+      </w:r>
+      <w:proofErr w:type="spellEnd"/>
+      <w:r>
+        <w:rPr>
+          <w:rFonts w:ascii="Times New Roman" w:hAnsi="Times New Roman" w:cs="Times New Roman"/>
+          <w:color w:val="323130"/>
+          <w:sz w:val="25"/>
+          <w:szCs w:val="25"/>
+        </w:rPr>
+        <w:t>","</w:t>
+      </w:r>
+      <w:proofErr w:type="spellStart"/>
+      <w:r>
+        <w:rPr>
+          <w:rFonts w:ascii="Times New Roman" w:hAnsi="Times New Roman" w:cs="Times New Roman"/>
+          <w:color w:val="323130"/>
+          <w:sz w:val="25"/>
+          <w:szCs w:val="25"/>
         </w:rPr>
         <w:t>spriteListId</w:t>
       </w:r>
@@ -5053,8 +5102,8 @@
         <w:rPr>
           <w:rFonts w:ascii="Times New Roman" w:hAnsi="Times New Roman" w:cs="Times New Roman"/>
           <w:color w:val="323130"/>
-          <w:sz w:val="27"/>
-          <w:szCs w:val="27"/>
+          <w:sz w:val="25"/>
+          <w:szCs w:val="25"/>
         </w:rPr>
         <w:t>": "</w:t>
       </w:r>
@@ -5063,8 +5112,8 @@
         <w:rPr>
           <w:rFonts w:ascii="Times New Roman" w:hAnsi="Times New Roman" w:cs="Times New Roman"/>
           <w:color w:val="323130"/>
-          <w:sz w:val="27"/>
-          <w:szCs w:val="27"/>
+          <w:sz w:val="25"/>
+          <w:szCs w:val="25"/>
         </w:rPr>
         <w:t>bonusSymbolLandSet</w:t>
       </w:r>
@@ -5073,452 +5122,16 @@
         <w:rPr>
           <w:rFonts w:ascii="Times New Roman" w:hAnsi="Times New Roman" w:cs="Times New Roman"/>
           <w:color w:val="323130"/>
-          <w:sz w:val="27"/>
-          <w:szCs w:val="27"/>
-        </w:rPr>
-        <w:t>"</w:t>
-      </w:r>
-    </w:p>
-    <w:p>
-      <w:pPr>
-        <w:spacing w:after="240"/>
-        <w:ind w:left="1200"/>
-        <w:rPr>
-          <w:rFonts w:ascii="Times New Roman" w:hAnsi="Times New Roman" w:cs="Times New Roman"/>
-          <w:color w:val="323130"/>
-          <w:sz w:val="27"/>
-          <w:szCs w:val="27"/>
-        </w:rPr>
-      </w:pPr>
-      <w:r>
-        <w:rPr>
-          <w:rFonts w:ascii="Times New Roman" w:hAnsi="Times New Roman" w:cs="Times New Roman"/>
-          <w:color w:val="323130"/>
-          <w:sz w:val="27"/>
-          <w:szCs w:val="27"/>
-        </w:rPr>
-        <w:t>},</w:t>
-      </w:r>
-    </w:p>
-    <w:p>
-      <w:pPr>
-        <w:spacing w:after="240"/>
-        <w:ind w:left="1200"/>
-        <w:rPr>
-          <w:rFonts w:ascii="Times New Roman" w:hAnsi="Times New Roman" w:cs="Times New Roman"/>
-          <w:color w:val="323130"/>
-          <w:sz w:val="27"/>
-          <w:szCs w:val="27"/>
-        </w:rPr>
-      </w:pPr>
-      <w:r>
-        <w:rPr>
-          <w:rFonts w:ascii="Times New Roman" w:hAnsi="Times New Roman" w:cs="Times New Roman"/>
-          <w:color w:val="323130"/>
-          <w:sz w:val="27"/>
-          <w:szCs w:val="27"/>
-        </w:rPr>
-        <w:t>{</w:t>
-      </w:r>
-    </w:p>
-    <w:p>
-      <w:pPr>
-        <w:spacing w:after="240"/>
-        <w:ind w:left="1200"/>
-        <w:rPr>
-          <w:rFonts w:ascii="Times New Roman" w:hAnsi="Times New Roman" w:cs="Times New Roman"/>
-          <w:color w:val="323130"/>
-          <w:sz w:val="27"/>
-          <w:szCs w:val="27"/>
-        </w:rPr>
-      </w:pPr>
-      <w:r>
-        <w:rPr>
-          <w:rFonts w:ascii="Times New Roman" w:hAnsi="Times New Roman" w:cs="Times New Roman"/>
-          <w:color w:val="323130"/>
-          <w:sz w:val="27"/>
-          <w:szCs w:val="27"/>
-        </w:rPr>
-        <w:t>"command": "Execute",</w:t>
-      </w:r>
-    </w:p>
-    <w:p>
-      <w:pPr>
-        <w:spacing w:after="240"/>
-        <w:ind w:left="1200"/>
-        <w:rPr>
-          <w:rFonts w:ascii="Times New Roman" w:hAnsi="Times New Roman" w:cs="Times New Roman"/>
-          <w:color w:val="323130"/>
-          <w:sz w:val="27"/>
-          <w:szCs w:val="27"/>
-        </w:rPr>
-      </w:pPr>
-      <w:r>
-        <w:rPr>
-          <w:rFonts w:ascii="Times New Roman" w:hAnsi="Times New Roman" w:cs="Times New Roman"/>
-          <w:color w:val="323130"/>
-          <w:sz w:val="27"/>
-          <w:szCs w:val="27"/>
-        </w:rPr>
-        <w:t>"</w:t>
-      </w:r>
-      <w:proofErr w:type="spellStart"/>
-      <w:r>
-        <w:rPr>
-          <w:rFonts w:ascii="Times New Roman" w:hAnsi="Times New Roman" w:cs="Times New Roman"/>
-          <w:color w:val="323130"/>
-          <w:sz w:val="27"/>
-          <w:szCs w:val="27"/>
-        </w:rPr>
-        <w:t>commandId</w:t>
-      </w:r>
-      <w:proofErr w:type="spellEnd"/>
-      <w:r>
-        <w:rPr>
-          <w:rFonts w:ascii="Times New Roman" w:hAnsi="Times New Roman" w:cs="Times New Roman"/>
-          <w:color w:val="323130"/>
-          <w:sz w:val="27"/>
-          <w:szCs w:val="27"/>
-        </w:rPr>
-        <w:t>": "</w:t>
-      </w:r>
-      <w:proofErr w:type="spellStart"/>
-      <w:r>
-        <w:rPr>
-          <w:rFonts w:ascii="Times New Roman" w:hAnsi="Times New Roman" w:cs="Times New Roman"/>
-          <w:color w:val="323130"/>
-          <w:sz w:val="27"/>
-          <w:szCs w:val="27"/>
-        </w:rPr>
-        <w:t>resetAnticipationSpritelists</w:t>
-      </w:r>
-      <w:proofErr w:type="spellEnd"/>
-      <w:r>
-        <w:rPr>
-          <w:rFonts w:ascii="Times New Roman" w:hAnsi="Times New Roman" w:cs="Times New Roman"/>
-          <w:color w:val="323130"/>
-          <w:sz w:val="27"/>
-          <w:szCs w:val="27"/>
-        </w:rPr>
-        <w:t>"</w:t>
-      </w:r>
-    </w:p>
-    <w:p>
-      <w:pPr>
-        <w:spacing w:after="240"/>
-        <w:ind w:left="1200"/>
-        <w:rPr>
-          <w:rFonts w:ascii="Times New Roman" w:hAnsi="Times New Roman" w:cs="Times New Roman"/>
-          <w:color w:val="323130"/>
-          <w:sz w:val="27"/>
-          <w:szCs w:val="27"/>
-        </w:rPr>
-      </w:pPr>
-      <w:r>
-        <w:rPr>
-          <w:rFonts w:ascii="Times New Roman" w:hAnsi="Times New Roman" w:cs="Times New Roman"/>
-          <w:color w:val="323130"/>
-          <w:sz w:val="27"/>
-          <w:szCs w:val="27"/>
-        </w:rPr>
-        <w:t>}</w:t>
-      </w:r>
-    </w:p>
-    <w:p>
-      <w:pPr>
-        <w:spacing w:after="240"/>
-        <w:ind w:left="600"/>
-        <w:rPr>
-          <w:rFonts w:ascii="Times New Roman" w:hAnsi="Times New Roman" w:cs="Times New Roman"/>
-          <w:color w:val="323130"/>
-          <w:sz w:val="27"/>
-          <w:szCs w:val="27"/>
-        </w:rPr>
-      </w:pPr>
-      <w:r>
-        <w:rPr>
-          <w:rFonts w:ascii="Times New Roman" w:hAnsi="Times New Roman" w:cs="Times New Roman"/>
-          <w:color w:val="323130"/>
-          <w:sz w:val="27"/>
-          <w:szCs w:val="27"/>
-        </w:rPr>
-        <w:t>],</w:t>
-      </w:r>
-    </w:p>
-    <w:p>
-      <w:pPr>
-        <w:spacing w:after="240"/>
-        <w:ind w:left="600"/>
-        <w:rPr>
-          <w:rFonts w:ascii="Times New Roman" w:hAnsi="Times New Roman" w:cs="Times New Roman"/>
-          <w:color w:val="323130"/>
-          <w:sz w:val="27"/>
-          <w:szCs w:val="27"/>
-        </w:rPr>
-      </w:pPr>
-    </w:p>
-    <w:p>
-      <w:pPr>
-        <w:spacing w:after="240"/>
-        <w:ind w:left="600"/>
-        <w:rPr>
-          <w:rFonts w:ascii="Times New Roman" w:hAnsi="Times New Roman" w:cs="Times New Roman"/>
-          <w:color w:val="323130"/>
-          <w:sz w:val="27"/>
-          <w:szCs w:val="27"/>
-        </w:rPr>
-      </w:pPr>
-      <w:r>
-        <w:rPr>
-          <w:rFonts w:ascii="Times New Roman" w:hAnsi="Times New Roman" w:cs="Times New Roman"/>
-          <w:color w:val="323130"/>
-          <w:sz w:val="27"/>
-          <w:szCs w:val="27"/>
-        </w:rPr>
-        <w:t>This is the '</w:t>
-      </w:r>
-      <w:proofErr w:type="spellStart"/>
-      <w:r>
-        <w:rPr>
-          <w:rFonts w:ascii="Times New Roman" w:hAnsi="Times New Roman" w:cs="Times New Roman"/>
-          <w:color w:val="323130"/>
-          <w:sz w:val="27"/>
-          <w:szCs w:val="27"/>
-        </w:rPr>
-        <w:t>resetAnticipationSpritelists</w:t>
-      </w:r>
-      <w:proofErr w:type="spellEnd"/>
-      <w:r>
-        <w:rPr>
-          <w:rFonts w:ascii="Times New Roman" w:hAnsi="Times New Roman" w:cs="Times New Roman"/>
-          <w:color w:val="323130"/>
-          <w:sz w:val="27"/>
-          <w:szCs w:val="27"/>
-        </w:rPr>
-        <w:t>' command being executed in '</w:t>
-      </w:r>
-      <w:proofErr w:type="spellStart"/>
-      <w:r>
-        <w:rPr>
-          <w:rFonts w:ascii="Times New Roman" w:hAnsi="Times New Roman" w:cs="Times New Roman"/>
-          <w:color w:val="323130"/>
-          <w:sz w:val="27"/>
-          <w:szCs w:val="27"/>
-        </w:rPr>
-        <w:t>onBonusSymbolLand</w:t>
-      </w:r>
-      <w:proofErr w:type="spellEnd"/>
-      <w:r>
-        <w:rPr>
-          <w:rFonts w:ascii="Times New Roman" w:hAnsi="Times New Roman" w:cs="Times New Roman"/>
-          <w:color w:val="323130"/>
-          <w:sz w:val="27"/>
-          <w:szCs w:val="27"/>
-        </w:rPr>
-        <w:t>':</w:t>
-      </w:r>
-    </w:p>
-    <w:p>
-      <w:pPr>
-        <w:spacing w:after="240"/>
-        <w:ind w:left="600"/>
-        <w:rPr>
-          <w:rFonts w:ascii="Times New Roman" w:hAnsi="Times New Roman" w:cs="Times New Roman"/>
-          <w:color w:val="323130"/>
-          <w:sz w:val="27"/>
-          <w:szCs w:val="27"/>
-        </w:rPr>
-      </w:pPr>
-    </w:p>
-    <w:p>
-      <w:pPr>
-        <w:spacing w:after="240"/>
-        <w:ind w:left="1200"/>
-        <w:rPr>
-          <w:rFonts w:ascii="Times New Roman" w:hAnsi="Times New Roman" w:cs="Times New Roman"/>
-          <w:color w:val="323130"/>
-          <w:sz w:val="27"/>
-          <w:szCs w:val="27"/>
-        </w:rPr>
-      </w:pPr>
-      <w:r>
-        <w:rPr>
-          <w:rFonts w:ascii="Times New Roman" w:hAnsi="Times New Roman" w:cs="Times New Roman"/>
-          <w:color w:val="323130"/>
-          <w:sz w:val="27"/>
-          <w:szCs w:val="27"/>
-        </w:rPr>
-        <w:t>"</w:t>
-      </w:r>
-      <w:proofErr w:type="spellStart"/>
-      <w:r>
-        <w:rPr>
-          <w:rFonts w:ascii="Times New Roman" w:hAnsi="Times New Roman" w:cs="Times New Roman"/>
-          <w:color w:val="323130"/>
-          <w:sz w:val="27"/>
-          <w:szCs w:val="27"/>
-        </w:rPr>
-        <w:t>resetAnticipationSpritelists</w:t>
-      </w:r>
-      <w:proofErr w:type="spellEnd"/>
-      <w:r>
-        <w:rPr>
-          <w:rFonts w:ascii="Times New Roman" w:hAnsi="Times New Roman" w:cs="Times New Roman"/>
-          <w:color w:val="323130"/>
-          <w:sz w:val="27"/>
-          <w:szCs w:val="27"/>
-        </w:rPr>
-        <w:t>": [</w:t>
-      </w:r>
-    </w:p>
-    <w:p>
-      <w:pPr>
-        <w:spacing w:after="240"/>
-        <w:ind w:left="1200"/>
-        <w:rPr>
-          <w:rFonts w:ascii="Times New Roman" w:hAnsi="Times New Roman" w:cs="Times New Roman"/>
-          <w:color w:val="323130"/>
-          <w:sz w:val="27"/>
-          <w:szCs w:val="27"/>
-        </w:rPr>
-      </w:pPr>
-      <w:r>
-        <w:rPr>
-          <w:rFonts w:ascii="Times New Roman" w:hAnsi="Times New Roman" w:cs="Times New Roman"/>
-          <w:color w:val="323130"/>
-          <w:sz w:val="27"/>
-          <w:szCs w:val="27"/>
-        </w:rPr>
-        <w:t>{</w:t>
-      </w:r>
-    </w:p>
-    <w:p>
-      <w:pPr>
-        <w:spacing w:after="240"/>
-        <w:ind w:left="1200"/>
-        <w:rPr>
-          <w:rFonts w:ascii="Times New Roman" w:hAnsi="Times New Roman" w:cs="Times New Roman"/>
-          <w:color w:val="323130"/>
-          <w:sz w:val="27"/>
-          <w:szCs w:val="27"/>
-        </w:rPr>
-      </w:pPr>
-      <w:r>
-        <w:rPr>
-          <w:rFonts w:ascii="Times New Roman" w:hAnsi="Times New Roman" w:cs="Times New Roman"/>
-          <w:color w:val="323130"/>
-          <w:sz w:val="27"/>
-          <w:szCs w:val="27"/>
-        </w:rPr>
-        <w:t>"command": "</w:t>
-      </w:r>
-      <w:proofErr w:type="spellStart"/>
-      <w:r>
-        <w:rPr>
-          <w:rFonts w:ascii="Times New Roman" w:hAnsi="Times New Roman" w:cs="Times New Roman"/>
-          <w:color w:val="323130"/>
-          <w:sz w:val="27"/>
-          <w:szCs w:val="27"/>
-        </w:rPr>
-        <w:t>ResetSpriteList</w:t>
-      </w:r>
-      <w:proofErr w:type="spellEnd"/>
-      <w:r>
-        <w:rPr>
-          <w:rFonts w:ascii="Times New Roman" w:hAnsi="Times New Roman" w:cs="Times New Roman"/>
-          <w:color w:val="323130"/>
-          <w:sz w:val="27"/>
-          <w:szCs w:val="27"/>
-        </w:rPr>
-        <w:t>",</w:t>
-      </w:r>
-    </w:p>
-    <w:p>
-      <w:pPr>
-        <w:spacing w:after="240"/>
-        <w:ind w:left="1200"/>
-        <w:rPr>
-          <w:rFonts w:ascii="Times New Roman" w:hAnsi="Times New Roman" w:cs="Times New Roman"/>
-          <w:color w:val="323130"/>
-          <w:sz w:val="27"/>
-          <w:szCs w:val="27"/>
-        </w:rPr>
-      </w:pPr>
-      <w:r>
-        <w:rPr>
-          <w:rFonts w:ascii="Times New Roman" w:hAnsi="Times New Roman" w:cs="Times New Roman"/>
-          <w:color w:val="323130"/>
-          <w:sz w:val="27"/>
-          <w:szCs w:val="27"/>
-        </w:rPr>
-        <w:t>"</w:t>
-      </w:r>
-      <w:proofErr w:type="spellStart"/>
-      <w:r>
-        <w:rPr>
-          <w:rFonts w:ascii="Times New Roman" w:hAnsi="Times New Roman" w:cs="Times New Roman"/>
-          <w:color w:val="323130"/>
-          <w:sz w:val="27"/>
-          <w:szCs w:val="27"/>
-        </w:rPr>
-        <w:t>spriteListId</w:t>
-      </w:r>
-      <w:proofErr w:type="spellEnd"/>
-      <w:r>
-        <w:rPr>
-          <w:rFonts w:ascii="Times New Roman" w:hAnsi="Times New Roman" w:cs="Times New Roman"/>
-          <w:color w:val="323130"/>
-          <w:sz w:val="27"/>
-          <w:szCs w:val="27"/>
-        </w:rPr>
-        <w:t>": "</w:t>
-      </w:r>
-      <w:proofErr w:type="spellStart"/>
-      <w:r>
-        <w:rPr>
-          <w:rFonts w:ascii="Times New Roman" w:hAnsi="Times New Roman" w:cs="Times New Roman"/>
-          <w:color w:val="323130"/>
-          <w:sz w:val="27"/>
-          <w:szCs w:val="27"/>
-        </w:rPr>
-        <w:t>bonusSymbolLandSet</w:t>
-      </w:r>
-      <w:proofErr w:type="spellEnd"/>
-      <w:r>
-        <w:rPr>
-          <w:rFonts w:ascii="Times New Roman" w:hAnsi="Times New Roman" w:cs="Times New Roman"/>
-          <w:color w:val="323130"/>
-          <w:sz w:val="27"/>
-          <w:szCs w:val="27"/>
-        </w:rPr>
-        <w:t>"</w:t>
-      </w:r>
-    </w:p>
-    <w:p>
-      <w:pPr>
-        <w:spacing w:after="240"/>
-        <w:ind w:left="1200"/>
-        <w:rPr>
-          <w:rFonts w:ascii="Times New Roman" w:hAnsi="Times New Roman" w:cs="Times New Roman"/>
-          <w:color w:val="323130"/>
-          <w:sz w:val="27"/>
-          <w:szCs w:val="27"/>
-        </w:rPr>
-      </w:pPr>
-      <w:r>
-        <w:rPr>
-          <w:rFonts w:ascii="Times New Roman" w:hAnsi="Times New Roman" w:cs="Times New Roman"/>
-          <w:color w:val="323130"/>
-          <w:sz w:val="27"/>
-          <w:szCs w:val="27"/>
-        </w:rPr>
-        <w:t>}</w:t>
-      </w:r>
-    </w:p>
-    <w:p>
-      <w:pPr>
-        <w:spacing w:after="240"/>
-        <w:ind w:left="600"/>
+          <w:sz w:val="25"/>
+          <w:szCs w:val="25"/>
+        </w:rPr>
+        <w:t>"}</w:t>
+      </w:r>
+    </w:p>
+    <w:p>
+      <w:pPr>
+        <w:spacing w:after="240"/>
+        <w:ind w:firstLine="720"/>
         <w:rPr>
           <w:rFonts w:ascii="Times New Roman" w:hAnsi="Times New Roman" w:cs="Times New Roman"/>
           <w:color w:val="323130"/>

</xml_diff>